<commit_message>
style: elevate web portal and all 5 split documents to Gustav Klimt golden secessionist style
</commit_message>
<xml_diff>
--- a/富宇大境區分所有權人獨立分割正式提案申請書暨全體連署同意書.docx
+++ b/富宇大境區分所有權人獨立分割正式提案申請書暨全體連署同意書.docx
@@ -11,7 +11,7 @@
         <w:rPr>
           <w:rFonts w:ascii="PingFang TC" w:hAnsi="PingFang TC"/>
           <w:b/>
-          <w:color w:val="A83212"/>
+          <w:color w:val="B8860B"/>
           <w:sz w:val="34"/>
         </w:rPr>
         <w:t>富宇大境（A2 區）區分所有權人獨立分割正式提案申請書</w:t>
@@ -55,13 +55,14 @@
               <w:left w:w="110" w:type="dxa"/>
               <w:right w:w="110" w:type="dxa"/>
             </w:tcMar>
+            <w:shd w:fill="1A1D20"/>
           </w:tcPr>
           <w:p>
             <w:r>
               <w:rPr>
                 <w:rFonts w:ascii="PingFang TC" w:hAnsi="PingFang TC"/>
                 <w:b/>
-                <w:color w:val="A83212"/>
+                <w:color w:val="D4AF37"/>
                 <w:sz w:val="18"/>
               </w:rPr>
               <w:t>受 文 者</w:t>
@@ -78,12 +79,14 @@
               <w:left w:w="110" w:type="dxa"/>
               <w:right w:w="110" w:type="dxa"/>
             </w:tcMar>
+            <w:shd w:fill="1A1D20"/>
           </w:tcPr>
           <w:p>
             <w:r>
               <w:rPr>
                 <w:rFonts w:ascii="PingFang TC" w:hAnsi="PingFang TC"/>
-                <w:color w:val="2D3748"/>
+                <w:b/>
+                <w:color w:val="D4AF37"/>
                 <w:sz w:val="18"/>
               </w:rPr>
               <w:t>富宇大地社區管理委員會（主任委員 馬士傑 先生）</w:t>
@@ -104,6 +107,7 @@
               <w:left w:w="110" w:type="dxa"/>
               <w:right w:w="110" w:type="dxa"/>
             </w:tcMar>
+            <w:shd w:fill="FFFDF5"/>
           </w:tcPr>
           <w:p>
             <w:r>
@@ -127,6 +131,7 @@
               <w:left w:w="110" w:type="dxa"/>
               <w:right w:w="110" w:type="dxa"/>
             </w:tcMar>
+            <w:shd w:fill="FFFDF5"/>
           </w:tcPr>
           <w:p>
             <w:r>
@@ -151,6 +156,7 @@
               <w:left w:w="110" w:type="dxa"/>
               <w:right w:w="110" w:type="dxa"/>
             </w:tcMar>
+            <w:shd w:fill="FAF8F2"/>
           </w:tcPr>
           <w:p>
             <w:r>
@@ -174,6 +180,7 @@
               <w:left w:w="110" w:type="dxa"/>
               <w:right w:w="110" w:type="dxa"/>
             </w:tcMar>
+            <w:shd w:fill="FAF8F2"/>
           </w:tcPr>
           <w:p>
             <w:r>
@@ -198,6 +205,7 @@
               <w:left w:w="110" w:type="dxa"/>
               <w:right w:w="110" w:type="dxa"/>
             </w:tcMar>
+            <w:shd w:fill="FFFDF5"/>
           </w:tcPr>
           <w:p>
             <w:r>
@@ -221,6 +229,7 @@
               <w:left w:w="110" w:type="dxa"/>
               <w:right w:w="110" w:type="dxa"/>
             </w:tcMar>
+            <w:shd w:fill="FFFDF5"/>
           </w:tcPr>
           <w:p>
             <w:r>
@@ -262,6 +271,7 @@
               <w:right w:val="none"/>
               <w:bottom w:val="none"/>
             </w:tcBorders>
+            <w:shd w:fill="1A1D20"/>
           </w:tcPr>
           <w:p>
             <w:pPr>
@@ -271,7 +281,7 @@
               <w:rPr>
                 <w:rFonts w:ascii="PingFang TC" w:hAnsi="PingFang TC"/>
                 <w:b/>
-                <w:color w:val="A83212"/>
+                <w:color w:val="D4AF37"/>
                 <w:sz w:val="21"/>
               </w:rPr>
               <w:t>【主旨】</w:t>
@@ -281,7 +291,7 @@
               <w:rPr>
                 <w:rFonts w:ascii="PingFang TC" w:hAnsi="PingFang TC"/>
                 <w:b/>
-                <w:color w:val="2D3748"/>
+                <w:color w:val="D4AF37"/>
                 <w:sz w:val="19"/>
               </w:rPr>
               <w:t>為落實權責相符與居住自治原則，富宇大境（A2 區）全體 6 戶區分所有權人謹依《公寓大廈管理條例》第 26 條第 1 項規定，正式提請審議本區「依法自富宇大地社區管理委員會獨立分割、成立富宇大境管理委員會及辦理專案資產移交清算案」，並請列入下次管理委員會例行會議審議及排入下次區分所有權人會議正式決議，請 查照。</w:t>
@@ -299,7 +309,7 @@
         <w:rPr>
           <w:rFonts w:ascii="PingFang TC" w:hAnsi="PingFang TC"/>
           <w:b/>
-          <w:color w:val="A83212"/>
+          <w:color w:val="B8860B"/>
           <w:sz w:val="22"/>
         </w:rPr>
         <w:t>【說明】</w:t>
@@ -313,7 +323,7 @@
         <w:rPr>
           <w:rFonts w:ascii="PingFang TC" w:hAnsi="PingFang TC"/>
           <w:b/>
-          <w:color w:val="DE5814"/>
+          <w:color w:val="D4AF37"/>
           <w:sz w:val="19"/>
         </w:rPr>
         <w:t>一、法定獨立要件充分且明確：</w:t>
@@ -335,7 +345,7 @@
         <w:rPr>
           <w:rFonts w:ascii="PingFang TC" w:hAnsi="PingFang TC"/>
           <w:b/>
-          <w:color w:val="DE5814"/>
+          <w:color w:val="D4AF37"/>
           <w:sz w:val="19"/>
         </w:rPr>
         <w:t>二、生活機能自理，無公設依賴性：</w:t>
@@ -357,7 +367,7 @@
         <w:rPr>
           <w:rFonts w:ascii="PingFang TC" w:hAnsi="PingFang TC"/>
           <w:b/>
-          <w:color w:val="DE5814"/>
+          <w:color w:val="D4AF37"/>
           <w:sz w:val="19"/>
         </w:rPr>
         <w:t>三、專款定存單獨立立卷，產權清晰：</w:t>
@@ -401,7 +411,7 @@
         <w:rPr>
           <w:rFonts w:ascii="PingFang TC" w:hAnsi="PingFang TC"/>
           <w:b/>
-          <w:color w:val="A83212"/>
+          <w:color w:val="B8860B"/>
           <w:sz w:val="22"/>
         </w:rPr>
         <w:t>【辦法】</w:t>
@@ -415,7 +425,7 @@
         <w:rPr>
           <w:rFonts w:ascii="PingFang TC" w:hAnsi="PingFang TC"/>
           <w:b/>
-          <w:color w:val="D97706"/>
+          <w:color w:val="D4AF37"/>
           <w:sz w:val="19"/>
         </w:rPr>
         <w:t>一、提案審議排案：</w:t>
@@ -437,7 +447,7 @@
         <w:rPr>
           <w:rFonts w:ascii="PingFang TC" w:hAnsi="PingFang TC"/>
           <w:b/>
-          <w:color w:val="D97706"/>
+          <w:color w:val="D4AF37"/>
           <w:sz w:val="19"/>
         </w:rPr>
         <w:t>二、資產移交準備：</w:t>
@@ -459,7 +469,7 @@
         <w:rPr>
           <w:rFonts w:ascii="PingFang TC" w:hAnsi="PingFang TC"/>
           <w:b/>
-          <w:color w:val="D97706"/>
+          <w:color w:val="D4AF37"/>
           <w:sz w:val="19"/>
         </w:rPr>
         <w:t>三、報備變更協力：</w:t>
@@ -530,13 +540,14 @@
               <w:left w:w="80" w:type="dxa"/>
               <w:right w:w="80" w:type="dxa"/>
             </w:tcMar>
+            <w:shd w:fill="1A1D20"/>
           </w:tcPr>
           <w:p>
             <w:r>
               <w:rPr>
                 <w:rFonts w:ascii="PingFang TC" w:hAnsi="PingFang TC"/>
                 <w:b/>
-                <w:color w:val="FFFFFF"/>
+                <w:color w:val="D4AF37"/>
                 <w:sz w:val="18"/>
               </w:rPr>
               <w:t>戶號門牌</w:t>
@@ -553,13 +564,14 @@
               <w:left w:w="80" w:type="dxa"/>
               <w:right w:w="80" w:type="dxa"/>
             </w:tcMar>
+            <w:shd w:fill="1A1D20"/>
           </w:tcPr>
           <w:p>
             <w:r>
               <w:rPr>
                 <w:rFonts w:ascii="PingFang TC" w:hAnsi="PingFang TC"/>
                 <w:b/>
-                <w:color w:val="FFFFFF"/>
+                <w:color w:val="D4AF37"/>
                 <w:sz w:val="18"/>
               </w:rPr>
               <w:t>區權人姓名</w:t>
@@ -576,13 +588,14 @@
               <w:left w:w="80" w:type="dxa"/>
               <w:right w:w="80" w:type="dxa"/>
             </w:tcMar>
+            <w:shd w:fill="1A1D20"/>
           </w:tcPr>
           <w:p>
             <w:r>
               <w:rPr>
                 <w:rFonts w:ascii="PingFang TC" w:hAnsi="PingFang TC"/>
                 <w:b/>
-                <w:color w:val="FFFFFF"/>
+                <w:color w:val="D4AF37"/>
                 <w:sz w:val="18"/>
               </w:rPr>
               <w:t>身分證字號</w:t>
@@ -599,13 +612,14 @@
               <w:left w:w="80" w:type="dxa"/>
               <w:right w:w="80" w:type="dxa"/>
             </w:tcMar>
+            <w:shd w:fill="1A1D20"/>
           </w:tcPr>
           <w:p>
             <w:r>
               <w:rPr>
                 <w:rFonts w:ascii="PingFang TC" w:hAnsi="PingFang TC"/>
                 <w:b/>
-                <w:color w:val="FFFFFF"/>
+                <w:color w:val="D4AF37"/>
                 <w:sz w:val="18"/>
               </w:rPr>
               <w:t>聯絡電話</w:t>
@@ -622,13 +636,14 @@
               <w:left w:w="80" w:type="dxa"/>
               <w:right w:w="80" w:type="dxa"/>
             </w:tcMar>
+            <w:shd w:fill="1A1D20"/>
           </w:tcPr>
           <w:p>
             <w:r>
               <w:rPr>
                 <w:rFonts w:ascii="PingFang TC" w:hAnsi="PingFang TC"/>
                 <w:b/>
-                <w:color w:val="FFFFFF"/>
+                <w:color w:val="D4AF37"/>
                 <w:sz w:val="18"/>
               </w:rPr>
               <w:t>親筆簽名</w:t>
@@ -645,13 +660,14 @@
               <w:left w:w="80" w:type="dxa"/>
               <w:right w:w="80" w:type="dxa"/>
             </w:tcMar>
+            <w:shd w:fill="1A1D20"/>
           </w:tcPr>
           <w:p>
             <w:r>
               <w:rPr>
                 <w:rFonts w:ascii="PingFang TC" w:hAnsi="PingFang TC"/>
                 <w:b/>
-                <w:color w:val="FFFFFF"/>
+                <w:color w:val="D4AF37"/>
                 <w:sz w:val="18"/>
               </w:rPr>
               <w:t>印鑑蓋章 / 日期</w:t>
@@ -670,6 +686,7 @@
               <w:left w:w="80" w:type="dxa"/>
               <w:right w:w="80" w:type="dxa"/>
             </w:tcMar>
+            <w:shd w:fill="FFFDF5"/>
           </w:tcPr>
           <w:p>
             <w:r>
@@ -693,6 +710,7 @@
               <w:left w:w="80" w:type="dxa"/>
               <w:right w:w="80" w:type="dxa"/>
             </w:tcMar>
+            <w:shd w:fill="FFFDF5"/>
           </w:tcPr>
           <w:p/>
         </w:tc>
@@ -706,6 +724,7 @@
               <w:left w:w="80" w:type="dxa"/>
               <w:right w:w="80" w:type="dxa"/>
             </w:tcMar>
+            <w:shd w:fill="FFFDF5"/>
           </w:tcPr>
           <w:p/>
         </w:tc>
@@ -719,6 +738,7 @@
               <w:left w:w="80" w:type="dxa"/>
               <w:right w:w="80" w:type="dxa"/>
             </w:tcMar>
+            <w:shd w:fill="FFFDF5"/>
           </w:tcPr>
           <w:p/>
         </w:tc>
@@ -732,6 +752,7 @@
               <w:left w:w="80" w:type="dxa"/>
               <w:right w:w="80" w:type="dxa"/>
             </w:tcMar>
+            <w:shd w:fill="FFFDF5"/>
           </w:tcPr>
           <w:p/>
         </w:tc>
@@ -745,6 +766,7 @@
               <w:left w:w="80" w:type="dxa"/>
               <w:right w:w="80" w:type="dxa"/>
             </w:tcMar>
+            <w:shd w:fill="FFFDF5"/>
           </w:tcPr>
           <w:p/>
         </w:tc>
@@ -760,6 +782,7 @@
               <w:left w:w="80" w:type="dxa"/>
               <w:right w:w="80" w:type="dxa"/>
             </w:tcMar>
+            <w:shd w:fill="FAF8F2"/>
           </w:tcPr>
           <w:p>
             <w:r>
@@ -783,6 +806,7 @@
               <w:left w:w="80" w:type="dxa"/>
               <w:right w:w="80" w:type="dxa"/>
             </w:tcMar>
+            <w:shd w:fill="FAF8F2"/>
           </w:tcPr>
           <w:p/>
         </w:tc>
@@ -796,6 +820,7 @@
               <w:left w:w="80" w:type="dxa"/>
               <w:right w:w="80" w:type="dxa"/>
             </w:tcMar>
+            <w:shd w:fill="FAF8F2"/>
           </w:tcPr>
           <w:p/>
         </w:tc>
@@ -809,6 +834,7 @@
               <w:left w:w="80" w:type="dxa"/>
               <w:right w:w="80" w:type="dxa"/>
             </w:tcMar>
+            <w:shd w:fill="FAF8F2"/>
           </w:tcPr>
           <w:p/>
         </w:tc>
@@ -822,6 +848,7 @@
               <w:left w:w="80" w:type="dxa"/>
               <w:right w:w="80" w:type="dxa"/>
             </w:tcMar>
+            <w:shd w:fill="FAF8F2"/>
           </w:tcPr>
           <w:p/>
         </w:tc>
@@ -835,6 +862,7 @@
               <w:left w:w="80" w:type="dxa"/>
               <w:right w:w="80" w:type="dxa"/>
             </w:tcMar>
+            <w:shd w:fill="FAF8F2"/>
           </w:tcPr>
           <w:p/>
         </w:tc>
@@ -850,6 +878,7 @@
               <w:left w:w="80" w:type="dxa"/>
               <w:right w:w="80" w:type="dxa"/>
             </w:tcMar>
+            <w:shd w:fill="FFFDF5"/>
           </w:tcPr>
           <w:p>
             <w:r>
@@ -873,6 +902,7 @@
               <w:left w:w="80" w:type="dxa"/>
               <w:right w:w="80" w:type="dxa"/>
             </w:tcMar>
+            <w:shd w:fill="FFFDF5"/>
           </w:tcPr>
           <w:p/>
         </w:tc>
@@ -886,6 +916,7 @@
               <w:left w:w="80" w:type="dxa"/>
               <w:right w:w="80" w:type="dxa"/>
             </w:tcMar>
+            <w:shd w:fill="FFFDF5"/>
           </w:tcPr>
           <w:p/>
         </w:tc>
@@ -899,6 +930,7 @@
               <w:left w:w="80" w:type="dxa"/>
               <w:right w:w="80" w:type="dxa"/>
             </w:tcMar>
+            <w:shd w:fill="FFFDF5"/>
           </w:tcPr>
           <w:p/>
         </w:tc>
@@ -912,6 +944,7 @@
               <w:left w:w="80" w:type="dxa"/>
               <w:right w:w="80" w:type="dxa"/>
             </w:tcMar>
+            <w:shd w:fill="FFFDF5"/>
           </w:tcPr>
           <w:p/>
         </w:tc>
@@ -925,6 +958,7 @@
               <w:left w:w="80" w:type="dxa"/>
               <w:right w:w="80" w:type="dxa"/>
             </w:tcMar>
+            <w:shd w:fill="FFFDF5"/>
           </w:tcPr>
           <w:p/>
         </w:tc>
@@ -940,6 +974,7 @@
               <w:left w:w="80" w:type="dxa"/>
               <w:right w:w="80" w:type="dxa"/>
             </w:tcMar>
+            <w:shd w:fill="FAF8F2"/>
           </w:tcPr>
           <w:p>
             <w:r>
@@ -963,6 +998,7 @@
               <w:left w:w="80" w:type="dxa"/>
               <w:right w:w="80" w:type="dxa"/>
             </w:tcMar>
+            <w:shd w:fill="FAF8F2"/>
           </w:tcPr>
           <w:p/>
         </w:tc>
@@ -976,6 +1012,7 @@
               <w:left w:w="80" w:type="dxa"/>
               <w:right w:w="80" w:type="dxa"/>
             </w:tcMar>
+            <w:shd w:fill="FAF8F2"/>
           </w:tcPr>
           <w:p/>
         </w:tc>
@@ -989,6 +1026,7 @@
               <w:left w:w="80" w:type="dxa"/>
               <w:right w:w="80" w:type="dxa"/>
             </w:tcMar>
+            <w:shd w:fill="FAF8F2"/>
           </w:tcPr>
           <w:p/>
         </w:tc>
@@ -1002,6 +1040,7 @@
               <w:left w:w="80" w:type="dxa"/>
               <w:right w:w="80" w:type="dxa"/>
             </w:tcMar>
+            <w:shd w:fill="FAF8F2"/>
           </w:tcPr>
           <w:p/>
         </w:tc>
@@ -1015,6 +1054,7 @@
               <w:left w:w="80" w:type="dxa"/>
               <w:right w:w="80" w:type="dxa"/>
             </w:tcMar>
+            <w:shd w:fill="FAF8F2"/>
           </w:tcPr>
           <w:p/>
         </w:tc>
@@ -1030,6 +1070,7 @@
               <w:left w:w="80" w:type="dxa"/>
               <w:right w:w="80" w:type="dxa"/>
             </w:tcMar>
+            <w:shd w:fill="FFFDF5"/>
           </w:tcPr>
           <w:p>
             <w:r>
@@ -1053,6 +1094,7 @@
               <w:left w:w="80" w:type="dxa"/>
               <w:right w:w="80" w:type="dxa"/>
             </w:tcMar>
+            <w:shd w:fill="FFFDF5"/>
           </w:tcPr>
           <w:p/>
         </w:tc>
@@ -1066,6 +1108,7 @@
               <w:left w:w="80" w:type="dxa"/>
               <w:right w:w="80" w:type="dxa"/>
             </w:tcMar>
+            <w:shd w:fill="FFFDF5"/>
           </w:tcPr>
           <w:p/>
         </w:tc>
@@ -1079,6 +1122,7 @@
               <w:left w:w="80" w:type="dxa"/>
               <w:right w:w="80" w:type="dxa"/>
             </w:tcMar>
+            <w:shd w:fill="FFFDF5"/>
           </w:tcPr>
           <w:p/>
         </w:tc>
@@ -1092,6 +1136,7 @@
               <w:left w:w="80" w:type="dxa"/>
               <w:right w:w="80" w:type="dxa"/>
             </w:tcMar>
+            <w:shd w:fill="FFFDF5"/>
           </w:tcPr>
           <w:p/>
         </w:tc>
@@ -1105,6 +1150,7 @@
               <w:left w:w="80" w:type="dxa"/>
               <w:right w:w="80" w:type="dxa"/>
             </w:tcMar>
+            <w:shd w:fill="FFFDF5"/>
           </w:tcPr>
           <w:p/>
         </w:tc>
@@ -1120,6 +1166,7 @@
               <w:left w:w="80" w:type="dxa"/>
               <w:right w:w="80" w:type="dxa"/>
             </w:tcMar>
+            <w:shd w:fill="FAF8F2"/>
           </w:tcPr>
           <w:p>
             <w:r>
@@ -1143,6 +1190,7 @@
               <w:left w:w="80" w:type="dxa"/>
               <w:right w:w="80" w:type="dxa"/>
             </w:tcMar>
+            <w:shd w:fill="FAF8F2"/>
           </w:tcPr>
           <w:p/>
         </w:tc>
@@ -1156,6 +1204,7 @@
               <w:left w:w="80" w:type="dxa"/>
               <w:right w:w="80" w:type="dxa"/>
             </w:tcMar>
+            <w:shd w:fill="FAF8F2"/>
           </w:tcPr>
           <w:p/>
         </w:tc>
@@ -1169,6 +1218,7 @@
               <w:left w:w="80" w:type="dxa"/>
               <w:right w:w="80" w:type="dxa"/>
             </w:tcMar>
+            <w:shd w:fill="FAF8F2"/>
           </w:tcPr>
           <w:p/>
         </w:tc>
@@ -1182,6 +1232,7 @@
               <w:left w:w="80" w:type="dxa"/>
               <w:right w:w="80" w:type="dxa"/>
             </w:tcMar>
+            <w:shd w:fill="FAF8F2"/>
           </w:tcPr>
           <w:p/>
         </w:tc>
@@ -1195,6 +1246,7 @@
               <w:left w:w="80" w:type="dxa"/>
               <w:right w:w="80" w:type="dxa"/>
             </w:tcMar>
+            <w:shd w:fill="FAF8F2"/>
           </w:tcPr>
           <w:p/>
         </w:tc>
@@ -1231,6 +1283,7 @@
               <w:right w:val="none"/>
               <w:bottom w:val="none"/>
             </w:tcBorders>
+            <w:shd w:fill="1A1D20"/>
           </w:tcPr>
           <w:p>
             <w:pPr>
@@ -1240,7 +1293,7 @@
               <w:rPr>
                 <w:rFonts w:ascii="PingFang TC" w:hAnsi="PingFang TC"/>
                 <w:b/>
-                <w:color w:val="DE5814"/>
+                <w:color w:val="D4AF37"/>
                 <w:sz w:val="20"/>
               </w:rPr>
               <w:t>【全體區權人共同委任授權條款】</w:t>
@@ -1249,7 +1302,8 @@
             <w:r>
               <w:rPr>
                 <w:rFonts w:ascii="PingFang TC" w:hAnsi="PingFang TC"/>
-                <w:color w:val="2D3748"/>
+                <w:b/>
+                <w:color w:val="D4AF37"/>
                 <w:sz w:val="18"/>
               </w:rPr>
               <w:t>本連署人等謹此共同推派並全權委託 ________________ 先生／女士 代表本區 6 戶區權人，全權向富宇大地社區管理委員會提出本提案申請書、出席協商會議、確認資產清算明細，並向台中市龍井區公所辦理獨立管委會備查相關事宜。</w:t>
@@ -1269,7 +1323,7 @@
         <w:rPr>
           <w:rFonts w:ascii="PingFang TC" w:hAnsi="PingFang TC"/>
           <w:b/>
-          <w:color w:val="A83212"/>
+          <w:color w:val="D4AF37"/>
           <w:sz w:val="20"/>
         </w:rPr>
         <w:t>【檢附附件】</w:t>
@@ -1282,7 +1336,7 @@
       <w:r>
         <w:rPr>
           <w:rFonts w:ascii="PingFang TC" w:hAnsi="PingFang TC"/>
-          <w:color w:val="2D3748"/>
+          <w:color w:val="B8860B"/>
           <w:sz w:val="17"/>
         </w:rPr>
         <w:t>附件一：《富宇大境社區管理委員會法定獨立分割可行性研究與實務推進執行報告書》（全本乙份）</w:t>
@@ -1321,7 +1375,7 @@
       <w:r>
         <w:rPr>
           <w:rFonts w:ascii="PingFang TC" w:hAnsi="PingFang TC"/>
-          <w:color w:val="2D3748"/>
+          <w:color w:val="B8860B"/>
           <w:sz w:val="17"/>
         </w:rPr>
         <w:t>附件四：《富宇大境共用設施無依賴切結與生活垃圾自行清運承諾書》</w:t>
@@ -1346,13 +1400,50 @@
       <w:pStyle w:val="Footer"/>
       <w:jc w:val="center"/>
     </w:pPr>
+    <w:r/>
     <w:r>
       <w:rPr>
         <w:rFonts w:ascii="PingFang TC" w:hAnsi="PingFang TC"/>
-        <w:color w:val="718096"/>
+        <w:color w:val="8C8273"/>
         <w:sz w:val="17"/>
       </w:rPr>
-      <w:t>專案編制作證：Howard Liao Ph.D.  ｜  依《公寓大廈管理條例》第 26 條第 1 項規定編制</w:t>
+      <w:t xml:space="preserve">報告人：Howard Liao Ph.D.  ｜  克林姆金色典藏版  ｜  第 </w:t>
+    </w:r>
+    <w:fldSimple w:instr="PAGE">
+      <w:r>
+        <w:rPr>
+          <w:rFonts w:ascii="PingFang TC" w:eastAsia="PingFang TC"/>
+          <w:sz w:val="17"/>
+          <w:color w:val="8C8273"/>
+        </w:rPr>
+        <w:t>1</w:t>
+      </w:r>
+    </w:fldSimple>
+    <w:r>
+      <w:rPr>
+        <w:rFonts w:ascii="PingFang TC" w:hAnsi="PingFang TC"/>
+        <w:color w:val="8C8273"/>
+        <w:sz w:val="17"/>
+      </w:rPr>
+      <w:t xml:space="preserve"> 頁  /  共 </w:t>
+    </w:r>
+    <w:fldSimple w:instr="NUMPAGES">
+      <w:r>
+        <w:rPr>
+          <w:rFonts w:ascii="PingFang TC" w:eastAsia="PingFang TC"/>
+          <w:sz w:val="17"/>
+          <w:color w:val="8C8273"/>
+        </w:rPr>
+        <w:t>1</w:t>
+      </w:r>
+    </w:fldSimple>
+    <w:r>
+      <w:rPr>
+        <w:rFonts w:ascii="PingFang TC" w:hAnsi="PingFang TC"/>
+        <w:color w:val="8C8273"/>
+        <w:sz w:val="17"/>
+      </w:rPr>
+      <w:t xml:space="preserve"> 頁</w:t>
     </w:r>
   </w:p>
 </w:ftr>

</xml_diff>

<commit_message>
fix(docs): update door numbers (593~603), remove 628巷, and assign 廖倫豪 先生 as authorized convenor
</commit_message>
<xml_diff>
--- a/富宇大境區分所有權人獨立分割正式提案申請書暨全體連署同意書.docx
+++ b/富宇大境區分所有權人獨立分割正式提案申請書暨全體連署同意書.docx
@@ -238,7 +238,7 @@
                 <w:color w:val="2D3748"/>
                 <w:sz w:val="18"/>
               </w:rPr>
-              <w:t>________________ 先生／女士（由全體 6 戶推派代表受託全權對外接洽、協商與簽收公文）</w:t>
+              <w:t>廖倫豪 先生（由全體 6 戶推派代表受託全權對外接洽、協商與簽收公文）</w:t>
             </w:r>
           </w:p>
         </w:tc>
@@ -334,7 +334,7 @@
           <w:color w:val="2D3748"/>
           <w:sz w:val="18"/>
         </w:rPr>
-        <w:t>按《公寓大廈管理條例》第 26 條第 1 項明定：「多數各自獨立使用之建築物、公寓大廈……如各該區得獨立使用且能分別成立管理委員會者，得經各該區區分所有權人會議決議後，分別成立管理委員會。」本區（A2 大境共 6 戶透天別墅，門牌為台中市沙鹿區龍社路 595、597、599、601、603、605 號）之基地臨接公有計畫道路龍社路，出入交通完全獨立，絕不途經富宇大地內部 628 巷或 642 巷等私設巷道，符合得各自獨立使用之法定要件。</w:t>
+        <w:t>按《公寓大廈管理條例》第 26 條第 1 項明定：「多數各自獨立使用之建築物、公寓大廈……如各該區得獨立使用且能分別成立管理委員會者，得經各該區區分所有權人會議決議後，分別成立管理委員會。」本區（A2 大境共 6 戶透天別墅，門牌為台中市沙鹿區龍社路 593、595、597、599、601、603 號）之基地臨接公有計畫道路龍社路，出入交通完全獨立，絕不途經富宇大地內部私設巷道（如 642 巷等），符合得各自獨立使用之法定要件。</w:t>
       </w:r>
     </w:p>
     <w:p>
@@ -696,7 +696,7 @@
                 <w:color w:val="A83212"/>
                 <w:sz w:val="18"/>
               </w:rPr>
-              <w:t>龍社路 595 號</w:t>
+              <w:t>龍社路 593 號</w:t>
             </w:r>
           </w:p>
         </w:tc>
@@ -792,7 +792,7 @@
                 <w:color w:val="A83212"/>
                 <w:sz w:val="18"/>
               </w:rPr>
-              <w:t>龍社路 597 號</w:t>
+              <w:t>龍社路 595 號</w:t>
             </w:r>
           </w:p>
         </w:tc>
@@ -888,7 +888,7 @@
                 <w:color w:val="A83212"/>
                 <w:sz w:val="18"/>
               </w:rPr>
-              <w:t>龍社路 599 號</w:t>
+              <w:t>龍社路 597 號</w:t>
             </w:r>
           </w:p>
         </w:tc>
@@ -984,7 +984,7 @@
                 <w:color w:val="A83212"/>
                 <w:sz w:val="18"/>
               </w:rPr>
-              <w:t>龍社路 601 號</w:t>
+              <w:t>龍社路 599 號</w:t>
             </w:r>
           </w:p>
         </w:tc>
@@ -1080,7 +1080,7 @@
                 <w:color w:val="A83212"/>
                 <w:sz w:val="18"/>
               </w:rPr>
-              <w:t>龍社路 603 號</w:t>
+              <w:t>龍社路 601 號</w:t>
             </w:r>
           </w:p>
         </w:tc>
@@ -1176,7 +1176,7 @@
                 <w:color w:val="A83212"/>
                 <w:sz w:val="18"/>
               </w:rPr>
-              <w:t>龍社路 605 號</w:t>
+              <w:t>龍社路 603 號</w:t>
             </w:r>
           </w:p>
         </w:tc>
@@ -1306,7 +1306,7 @@
                 <w:color w:val="D4AF37"/>
                 <w:sz w:val="18"/>
               </w:rPr>
-              <w:t>本連署人等謹此共同推派並全權委託 ________________ 先生／女士 代表本區 6 戶區權人，全權向富宇大地社區管理委員會提出本提案申請書、出席協商會議、確認資產清算明細，並向台中市龍井區公所辦理獨立管委會備查相關事宜。</w:t>
+              <w:t>本連署人等謹此共同推派並全權委託 廖倫豪 先生 代表本區 6 戶區權人，全權向富宇大地社區管理委員會提出本提案申請書、出席協商會議、確認資產清算明細，並向台中市龍井區公所辦理獨立管委會備查相關事宜。</w:t>
               <w:br/>
               <w:t>中華民國 115 年 _____ 月 _____ 日</w:t>
             </w:r>

</xml_diff>

<commit_message>
fix(docs): remove '克林姆金色典藏版' text labels from headers/footers while retaining gold aesthetic
</commit_message>
<xml_diff>
--- a/富宇大境區分所有權人獨立分割正式提案申請書暨全體連署同意書.docx
+++ b/富宇大境區分所有權人獨立分割正式提案申請書暨全體連署同意書.docx
@@ -56,6 +56,7 @@
               <w:right w:w="110" w:type="dxa"/>
             </w:tcMar>
             <w:shd w:fill="1A1D20"/>
+            <w:shd w:fill="1A1D20"/>
           </w:tcPr>
           <w:p>
             <w:r>
@@ -79,6 +80,7 @@
               <w:left w:w="110" w:type="dxa"/>
               <w:right w:w="110" w:type="dxa"/>
             </w:tcMar>
+            <w:shd w:fill="1A1D20"/>
             <w:shd w:fill="1A1D20"/>
           </w:tcPr>
           <w:p>
@@ -108,6 +110,7 @@
               <w:right w:w="110" w:type="dxa"/>
             </w:tcMar>
             <w:shd w:fill="FFFDF5"/>
+            <w:shd w:fill="FFFDF5"/>
           </w:tcPr>
           <w:p>
             <w:r>
@@ -131,6 +134,7 @@
               <w:left w:w="110" w:type="dxa"/>
               <w:right w:w="110" w:type="dxa"/>
             </w:tcMar>
+            <w:shd w:fill="FFFDF5"/>
             <w:shd w:fill="FFFDF5"/>
           </w:tcPr>
           <w:p>
@@ -157,6 +161,7 @@
               <w:right w:w="110" w:type="dxa"/>
             </w:tcMar>
             <w:shd w:fill="FAF8F2"/>
+            <w:shd w:fill="FAF8F2"/>
           </w:tcPr>
           <w:p>
             <w:r>
@@ -180,6 +185,7 @@
               <w:left w:w="110" w:type="dxa"/>
               <w:right w:w="110" w:type="dxa"/>
             </w:tcMar>
+            <w:shd w:fill="FAF8F2"/>
             <w:shd w:fill="FAF8F2"/>
           </w:tcPr>
           <w:p>
@@ -206,6 +212,7 @@
               <w:right w:w="110" w:type="dxa"/>
             </w:tcMar>
             <w:shd w:fill="FFFDF5"/>
+            <w:shd w:fill="FFFDF5"/>
           </w:tcPr>
           <w:p>
             <w:r>
@@ -229,6 +236,7 @@
               <w:left w:w="110" w:type="dxa"/>
               <w:right w:w="110" w:type="dxa"/>
             </w:tcMar>
+            <w:shd w:fill="FFFDF5"/>
             <w:shd w:fill="FFFDF5"/>
           </w:tcPr>
           <w:p>
@@ -271,6 +279,7 @@
               <w:right w:val="none"/>
               <w:bottom w:val="none"/>
             </w:tcBorders>
+            <w:shd w:fill="1A1D20"/>
             <w:shd w:fill="1A1D20"/>
           </w:tcPr>
           <w:p>
@@ -541,6 +550,7 @@
               <w:right w:w="80" w:type="dxa"/>
             </w:tcMar>
             <w:shd w:fill="1A1D20"/>
+            <w:shd w:fill="1A1D20"/>
           </w:tcPr>
           <w:p>
             <w:r>
@@ -564,6 +574,7 @@
               <w:left w:w="80" w:type="dxa"/>
               <w:right w:w="80" w:type="dxa"/>
             </w:tcMar>
+            <w:shd w:fill="1A1D20"/>
             <w:shd w:fill="1A1D20"/>
           </w:tcPr>
           <w:p>
@@ -589,6 +600,7 @@
               <w:right w:w="80" w:type="dxa"/>
             </w:tcMar>
             <w:shd w:fill="1A1D20"/>
+            <w:shd w:fill="1A1D20"/>
           </w:tcPr>
           <w:p>
             <w:r>
@@ -612,6 +624,7 @@
               <w:left w:w="80" w:type="dxa"/>
               <w:right w:w="80" w:type="dxa"/>
             </w:tcMar>
+            <w:shd w:fill="1A1D20"/>
             <w:shd w:fill="1A1D20"/>
           </w:tcPr>
           <w:p>
@@ -637,6 +650,7 @@
               <w:right w:w="80" w:type="dxa"/>
             </w:tcMar>
             <w:shd w:fill="1A1D20"/>
+            <w:shd w:fill="1A1D20"/>
           </w:tcPr>
           <w:p>
             <w:r>
@@ -660,6 +674,7 @@
               <w:left w:w="80" w:type="dxa"/>
               <w:right w:w="80" w:type="dxa"/>
             </w:tcMar>
+            <w:shd w:fill="1A1D20"/>
             <w:shd w:fill="1A1D20"/>
           </w:tcPr>
           <w:p>
@@ -687,6 +702,7 @@
               <w:right w:w="80" w:type="dxa"/>
             </w:tcMar>
             <w:shd w:fill="FFFDF5"/>
+            <w:shd w:fill="FFFDF5"/>
           </w:tcPr>
           <w:p>
             <w:r>
@@ -711,19 +727,6 @@
               <w:right w:w="80" w:type="dxa"/>
             </w:tcMar>
             <w:shd w:fill="FFFDF5"/>
-          </w:tcPr>
-          <w:p/>
-        </w:tc>
-        <w:tc>
-          <w:tcPr>
-            <w:tcW w:type="dxa" w:w="1587"/>
-            <w:shd w:fill="FFFFFF"/>
-            <w:tcMar>
-              <w:top w:w="140" w:type="dxa"/>
-              <w:bottom w:w="140" w:type="dxa"/>
-              <w:left w:w="80" w:type="dxa"/>
-              <w:right w:w="80" w:type="dxa"/>
-            </w:tcMar>
             <w:shd w:fill="FFFDF5"/>
           </w:tcPr>
           <w:p/>
@@ -739,6 +742,22 @@
               <w:right w:w="80" w:type="dxa"/>
             </w:tcMar>
             <w:shd w:fill="FFFDF5"/>
+            <w:shd w:fill="FFFDF5"/>
+          </w:tcPr>
+          <w:p/>
+        </w:tc>
+        <w:tc>
+          <w:tcPr>
+            <w:tcW w:type="dxa" w:w="1587"/>
+            <w:shd w:fill="FFFFFF"/>
+            <w:tcMar>
+              <w:top w:w="140" w:type="dxa"/>
+              <w:bottom w:w="140" w:type="dxa"/>
+              <w:left w:w="80" w:type="dxa"/>
+              <w:right w:w="80" w:type="dxa"/>
+            </w:tcMar>
+            <w:shd w:fill="FFFDF5"/>
+            <w:shd w:fill="FFFDF5"/>
           </w:tcPr>
           <w:p/>
         </w:tc>
@@ -753,6 +772,7 @@
               <w:right w:w="80" w:type="dxa"/>
             </w:tcMar>
             <w:shd w:fill="FFFDF5"/>
+            <w:shd w:fill="FFFDF5"/>
           </w:tcPr>
           <w:p/>
         </w:tc>
@@ -766,6 +786,7 @@
               <w:left w:w="80" w:type="dxa"/>
               <w:right w:w="80" w:type="dxa"/>
             </w:tcMar>
+            <w:shd w:fill="FFFDF5"/>
             <w:shd w:fill="FFFDF5"/>
           </w:tcPr>
           <w:p/>
@@ -782,6 +803,7 @@
               <w:left w:w="80" w:type="dxa"/>
               <w:right w:w="80" w:type="dxa"/>
             </w:tcMar>
+            <w:shd w:fill="FAF8F2"/>
             <w:shd w:fill="FAF8F2"/>
           </w:tcPr>
           <w:p>
@@ -807,19 +829,6 @@
               <w:right w:w="80" w:type="dxa"/>
             </w:tcMar>
             <w:shd w:fill="FAF8F2"/>
-          </w:tcPr>
-          <w:p/>
-        </w:tc>
-        <w:tc>
-          <w:tcPr>
-            <w:tcW w:type="dxa" w:w="1587"/>
-            <w:shd w:fill="F8FAFC"/>
-            <w:tcMar>
-              <w:top w:w="140" w:type="dxa"/>
-              <w:bottom w:w="140" w:type="dxa"/>
-              <w:left w:w="80" w:type="dxa"/>
-              <w:right w:w="80" w:type="dxa"/>
-            </w:tcMar>
             <w:shd w:fill="FAF8F2"/>
           </w:tcPr>
           <w:p/>
@@ -835,6 +844,22 @@
               <w:right w:w="80" w:type="dxa"/>
             </w:tcMar>
             <w:shd w:fill="FAF8F2"/>
+            <w:shd w:fill="FAF8F2"/>
+          </w:tcPr>
+          <w:p/>
+        </w:tc>
+        <w:tc>
+          <w:tcPr>
+            <w:tcW w:type="dxa" w:w="1587"/>
+            <w:shd w:fill="F8FAFC"/>
+            <w:tcMar>
+              <w:top w:w="140" w:type="dxa"/>
+              <w:bottom w:w="140" w:type="dxa"/>
+              <w:left w:w="80" w:type="dxa"/>
+              <w:right w:w="80" w:type="dxa"/>
+            </w:tcMar>
+            <w:shd w:fill="FAF8F2"/>
+            <w:shd w:fill="FAF8F2"/>
           </w:tcPr>
           <w:p/>
         </w:tc>
@@ -849,6 +874,7 @@
               <w:right w:w="80" w:type="dxa"/>
             </w:tcMar>
             <w:shd w:fill="FAF8F2"/>
+            <w:shd w:fill="FAF8F2"/>
           </w:tcPr>
           <w:p/>
         </w:tc>
@@ -862,6 +888,7 @@
               <w:left w:w="80" w:type="dxa"/>
               <w:right w:w="80" w:type="dxa"/>
             </w:tcMar>
+            <w:shd w:fill="FAF8F2"/>
             <w:shd w:fill="FAF8F2"/>
           </w:tcPr>
           <w:p/>
@@ -878,6 +905,7 @@
               <w:left w:w="80" w:type="dxa"/>
               <w:right w:w="80" w:type="dxa"/>
             </w:tcMar>
+            <w:shd w:fill="FFFDF5"/>
             <w:shd w:fill="FFFDF5"/>
           </w:tcPr>
           <w:p>
@@ -903,19 +931,6 @@
               <w:right w:w="80" w:type="dxa"/>
             </w:tcMar>
             <w:shd w:fill="FFFDF5"/>
-          </w:tcPr>
-          <w:p/>
-        </w:tc>
-        <w:tc>
-          <w:tcPr>
-            <w:tcW w:type="dxa" w:w="1587"/>
-            <w:shd w:fill="FFFFFF"/>
-            <w:tcMar>
-              <w:top w:w="140" w:type="dxa"/>
-              <w:bottom w:w="140" w:type="dxa"/>
-              <w:left w:w="80" w:type="dxa"/>
-              <w:right w:w="80" w:type="dxa"/>
-            </w:tcMar>
             <w:shd w:fill="FFFDF5"/>
           </w:tcPr>
           <w:p/>
@@ -931,6 +946,22 @@
               <w:right w:w="80" w:type="dxa"/>
             </w:tcMar>
             <w:shd w:fill="FFFDF5"/>
+            <w:shd w:fill="FFFDF5"/>
+          </w:tcPr>
+          <w:p/>
+        </w:tc>
+        <w:tc>
+          <w:tcPr>
+            <w:tcW w:type="dxa" w:w="1587"/>
+            <w:shd w:fill="FFFFFF"/>
+            <w:tcMar>
+              <w:top w:w="140" w:type="dxa"/>
+              <w:bottom w:w="140" w:type="dxa"/>
+              <w:left w:w="80" w:type="dxa"/>
+              <w:right w:w="80" w:type="dxa"/>
+            </w:tcMar>
+            <w:shd w:fill="FFFDF5"/>
+            <w:shd w:fill="FFFDF5"/>
           </w:tcPr>
           <w:p/>
         </w:tc>
@@ -945,6 +976,7 @@
               <w:right w:w="80" w:type="dxa"/>
             </w:tcMar>
             <w:shd w:fill="FFFDF5"/>
+            <w:shd w:fill="FFFDF5"/>
           </w:tcPr>
           <w:p/>
         </w:tc>
@@ -958,6 +990,7 @@
               <w:left w:w="80" w:type="dxa"/>
               <w:right w:w="80" w:type="dxa"/>
             </w:tcMar>
+            <w:shd w:fill="FFFDF5"/>
             <w:shd w:fill="FFFDF5"/>
           </w:tcPr>
           <w:p/>
@@ -974,6 +1007,7 @@
               <w:left w:w="80" w:type="dxa"/>
               <w:right w:w="80" w:type="dxa"/>
             </w:tcMar>
+            <w:shd w:fill="FAF8F2"/>
             <w:shd w:fill="FAF8F2"/>
           </w:tcPr>
           <w:p>
@@ -999,19 +1033,6 @@
               <w:right w:w="80" w:type="dxa"/>
             </w:tcMar>
             <w:shd w:fill="FAF8F2"/>
-          </w:tcPr>
-          <w:p/>
-        </w:tc>
-        <w:tc>
-          <w:tcPr>
-            <w:tcW w:type="dxa" w:w="1587"/>
-            <w:shd w:fill="F8FAFC"/>
-            <w:tcMar>
-              <w:top w:w="140" w:type="dxa"/>
-              <w:bottom w:w="140" w:type="dxa"/>
-              <w:left w:w="80" w:type="dxa"/>
-              <w:right w:w="80" w:type="dxa"/>
-            </w:tcMar>
             <w:shd w:fill="FAF8F2"/>
           </w:tcPr>
           <w:p/>
@@ -1027,6 +1048,22 @@
               <w:right w:w="80" w:type="dxa"/>
             </w:tcMar>
             <w:shd w:fill="FAF8F2"/>
+            <w:shd w:fill="FAF8F2"/>
+          </w:tcPr>
+          <w:p/>
+        </w:tc>
+        <w:tc>
+          <w:tcPr>
+            <w:tcW w:type="dxa" w:w="1587"/>
+            <w:shd w:fill="F8FAFC"/>
+            <w:tcMar>
+              <w:top w:w="140" w:type="dxa"/>
+              <w:bottom w:w="140" w:type="dxa"/>
+              <w:left w:w="80" w:type="dxa"/>
+              <w:right w:w="80" w:type="dxa"/>
+            </w:tcMar>
+            <w:shd w:fill="FAF8F2"/>
+            <w:shd w:fill="FAF8F2"/>
           </w:tcPr>
           <w:p/>
         </w:tc>
@@ -1041,6 +1078,7 @@
               <w:right w:w="80" w:type="dxa"/>
             </w:tcMar>
             <w:shd w:fill="FAF8F2"/>
+            <w:shd w:fill="FAF8F2"/>
           </w:tcPr>
           <w:p/>
         </w:tc>
@@ -1054,6 +1092,7 @@
               <w:left w:w="80" w:type="dxa"/>
               <w:right w:w="80" w:type="dxa"/>
             </w:tcMar>
+            <w:shd w:fill="FAF8F2"/>
             <w:shd w:fill="FAF8F2"/>
           </w:tcPr>
           <w:p/>
@@ -1070,6 +1109,7 @@
               <w:left w:w="80" w:type="dxa"/>
               <w:right w:w="80" w:type="dxa"/>
             </w:tcMar>
+            <w:shd w:fill="FFFDF5"/>
             <w:shd w:fill="FFFDF5"/>
           </w:tcPr>
           <w:p>
@@ -1095,19 +1135,6 @@
               <w:right w:w="80" w:type="dxa"/>
             </w:tcMar>
             <w:shd w:fill="FFFDF5"/>
-          </w:tcPr>
-          <w:p/>
-        </w:tc>
-        <w:tc>
-          <w:tcPr>
-            <w:tcW w:type="dxa" w:w="1587"/>
-            <w:shd w:fill="FFFFFF"/>
-            <w:tcMar>
-              <w:top w:w="140" w:type="dxa"/>
-              <w:bottom w:w="140" w:type="dxa"/>
-              <w:left w:w="80" w:type="dxa"/>
-              <w:right w:w="80" w:type="dxa"/>
-            </w:tcMar>
             <w:shd w:fill="FFFDF5"/>
           </w:tcPr>
           <w:p/>
@@ -1123,6 +1150,22 @@
               <w:right w:w="80" w:type="dxa"/>
             </w:tcMar>
             <w:shd w:fill="FFFDF5"/>
+            <w:shd w:fill="FFFDF5"/>
+          </w:tcPr>
+          <w:p/>
+        </w:tc>
+        <w:tc>
+          <w:tcPr>
+            <w:tcW w:type="dxa" w:w="1587"/>
+            <w:shd w:fill="FFFFFF"/>
+            <w:tcMar>
+              <w:top w:w="140" w:type="dxa"/>
+              <w:bottom w:w="140" w:type="dxa"/>
+              <w:left w:w="80" w:type="dxa"/>
+              <w:right w:w="80" w:type="dxa"/>
+            </w:tcMar>
+            <w:shd w:fill="FFFDF5"/>
+            <w:shd w:fill="FFFDF5"/>
           </w:tcPr>
           <w:p/>
         </w:tc>
@@ -1137,6 +1180,7 @@
               <w:right w:w="80" w:type="dxa"/>
             </w:tcMar>
             <w:shd w:fill="FFFDF5"/>
+            <w:shd w:fill="FFFDF5"/>
           </w:tcPr>
           <w:p/>
         </w:tc>
@@ -1150,6 +1194,7 @@
               <w:left w:w="80" w:type="dxa"/>
               <w:right w:w="80" w:type="dxa"/>
             </w:tcMar>
+            <w:shd w:fill="FFFDF5"/>
             <w:shd w:fill="FFFDF5"/>
           </w:tcPr>
           <w:p/>
@@ -1166,6 +1211,7 @@
               <w:left w:w="80" w:type="dxa"/>
               <w:right w:w="80" w:type="dxa"/>
             </w:tcMar>
+            <w:shd w:fill="FAF8F2"/>
             <w:shd w:fill="FAF8F2"/>
           </w:tcPr>
           <w:p>
@@ -1191,19 +1237,6 @@
               <w:right w:w="80" w:type="dxa"/>
             </w:tcMar>
             <w:shd w:fill="FAF8F2"/>
-          </w:tcPr>
-          <w:p/>
-        </w:tc>
-        <w:tc>
-          <w:tcPr>
-            <w:tcW w:type="dxa" w:w="1587"/>
-            <w:shd w:fill="F8FAFC"/>
-            <w:tcMar>
-              <w:top w:w="140" w:type="dxa"/>
-              <w:bottom w:w="140" w:type="dxa"/>
-              <w:left w:w="80" w:type="dxa"/>
-              <w:right w:w="80" w:type="dxa"/>
-            </w:tcMar>
             <w:shd w:fill="FAF8F2"/>
           </w:tcPr>
           <w:p/>
@@ -1219,6 +1252,22 @@
               <w:right w:w="80" w:type="dxa"/>
             </w:tcMar>
             <w:shd w:fill="FAF8F2"/>
+            <w:shd w:fill="FAF8F2"/>
+          </w:tcPr>
+          <w:p/>
+        </w:tc>
+        <w:tc>
+          <w:tcPr>
+            <w:tcW w:type="dxa" w:w="1587"/>
+            <w:shd w:fill="F8FAFC"/>
+            <w:tcMar>
+              <w:top w:w="140" w:type="dxa"/>
+              <w:bottom w:w="140" w:type="dxa"/>
+              <w:left w:w="80" w:type="dxa"/>
+              <w:right w:w="80" w:type="dxa"/>
+            </w:tcMar>
+            <w:shd w:fill="FAF8F2"/>
+            <w:shd w:fill="FAF8F2"/>
           </w:tcPr>
           <w:p/>
         </w:tc>
@@ -1233,6 +1282,7 @@
               <w:right w:w="80" w:type="dxa"/>
             </w:tcMar>
             <w:shd w:fill="FAF8F2"/>
+            <w:shd w:fill="FAF8F2"/>
           </w:tcPr>
           <w:p/>
         </w:tc>
@@ -1246,6 +1296,7 @@
               <w:left w:w="80" w:type="dxa"/>
               <w:right w:w="80" w:type="dxa"/>
             </w:tcMar>
+            <w:shd w:fill="FAF8F2"/>
             <w:shd w:fill="FAF8F2"/>
           </w:tcPr>
           <w:p/>
@@ -1283,6 +1334,7 @@
               <w:right w:val="none"/>
               <w:bottom w:val="none"/>
             </w:tcBorders>
+            <w:shd w:fill="1A1D20"/>
             <w:shd w:fill="1A1D20"/>
           </w:tcPr>
           <w:p>
@@ -1406,7 +1458,7 @@
         <w:color w:val="8C8273"/>
         <w:sz w:val="17"/>
       </w:rPr>
-      <w:t xml:space="preserve">報告人：Howard Liao Ph.D.  ｜  克林姆金色典藏版  ｜  第 </w:t>
+      <w:t xml:space="preserve">報告人：Howard Liao Ph.D.  ｜  第 </w:t>
     </w:r>
     <w:fldSimple w:instr="PAGE">
       <w:r>

</xml_diff>

<commit_message>
feat(docs): standardize presenter attribution to '報告人：廖倫豪' across all Word and PDF documents
</commit_message>
<xml_diff>
--- a/富宇大境區分所有權人獨立分割正式提案申請書暨全體連署同意書.docx
+++ b/富宇大境區分所有權人獨立分割正式提案申請書暨全體連署同意書.docx
@@ -57,6 +57,7 @@
             </w:tcMar>
             <w:shd w:fill="1A1D20"/>
             <w:shd w:fill="1A1D20"/>
+            <w:shd w:fill="1A1D20"/>
           </w:tcPr>
           <w:p>
             <w:r>
@@ -80,6 +81,7 @@
               <w:left w:w="110" w:type="dxa"/>
               <w:right w:w="110" w:type="dxa"/>
             </w:tcMar>
+            <w:shd w:fill="1A1D20"/>
             <w:shd w:fill="1A1D20"/>
             <w:shd w:fill="1A1D20"/>
           </w:tcPr>
@@ -111,6 +113,7 @@
             </w:tcMar>
             <w:shd w:fill="FFFDF5"/>
             <w:shd w:fill="FFFDF5"/>
+            <w:shd w:fill="FFFDF5"/>
           </w:tcPr>
           <w:p>
             <w:r>
@@ -134,6 +137,7 @@
               <w:left w:w="110" w:type="dxa"/>
               <w:right w:w="110" w:type="dxa"/>
             </w:tcMar>
+            <w:shd w:fill="FFFDF5"/>
             <w:shd w:fill="FFFDF5"/>
             <w:shd w:fill="FFFDF5"/>
           </w:tcPr>
@@ -162,6 +166,7 @@
             </w:tcMar>
             <w:shd w:fill="FAF8F2"/>
             <w:shd w:fill="FAF8F2"/>
+            <w:shd w:fill="FAF8F2"/>
           </w:tcPr>
           <w:p>
             <w:r>
@@ -185,6 +190,7 @@
               <w:left w:w="110" w:type="dxa"/>
               <w:right w:w="110" w:type="dxa"/>
             </w:tcMar>
+            <w:shd w:fill="FAF8F2"/>
             <w:shd w:fill="FAF8F2"/>
             <w:shd w:fill="FAF8F2"/>
           </w:tcPr>
@@ -213,6 +219,7 @@
             </w:tcMar>
             <w:shd w:fill="FFFDF5"/>
             <w:shd w:fill="FFFDF5"/>
+            <w:shd w:fill="FFFDF5"/>
           </w:tcPr>
           <w:p>
             <w:r>
@@ -236,6 +243,7 @@
               <w:left w:w="110" w:type="dxa"/>
               <w:right w:w="110" w:type="dxa"/>
             </w:tcMar>
+            <w:shd w:fill="FFFDF5"/>
             <w:shd w:fill="FFFDF5"/>
             <w:shd w:fill="FFFDF5"/>
           </w:tcPr>
@@ -279,6 +287,7 @@
               <w:right w:val="none"/>
               <w:bottom w:val="none"/>
             </w:tcBorders>
+            <w:shd w:fill="1A1D20"/>
             <w:shd w:fill="1A1D20"/>
             <w:shd w:fill="1A1D20"/>
           </w:tcPr>
@@ -551,6 +560,7 @@
             </w:tcMar>
             <w:shd w:fill="1A1D20"/>
             <w:shd w:fill="1A1D20"/>
+            <w:shd w:fill="1A1D20"/>
           </w:tcPr>
           <w:p>
             <w:r>
@@ -574,6 +584,7 @@
               <w:left w:w="80" w:type="dxa"/>
               <w:right w:w="80" w:type="dxa"/>
             </w:tcMar>
+            <w:shd w:fill="1A1D20"/>
             <w:shd w:fill="1A1D20"/>
             <w:shd w:fill="1A1D20"/>
           </w:tcPr>
@@ -601,6 +612,7 @@
             </w:tcMar>
             <w:shd w:fill="1A1D20"/>
             <w:shd w:fill="1A1D20"/>
+            <w:shd w:fill="1A1D20"/>
           </w:tcPr>
           <w:p>
             <w:r>
@@ -624,6 +636,7 @@
               <w:left w:w="80" w:type="dxa"/>
               <w:right w:w="80" w:type="dxa"/>
             </w:tcMar>
+            <w:shd w:fill="1A1D20"/>
             <w:shd w:fill="1A1D20"/>
             <w:shd w:fill="1A1D20"/>
           </w:tcPr>
@@ -651,6 +664,7 @@
             </w:tcMar>
             <w:shd w:fill="1A1D20"/>
             <w:shd w:fill="1A1D20"/>
+            <w:shd w:fill="1A1D20"/>
           </w:tcPr>
           <w:p>
             <w:r>
@@ -674,6 +688,7 @@
               <w:left w:w="80" w:type="dxa"/>
               <w:right w:w="80" w:type="dxa"/>
             </w:tcMar>
+            <w:shd w:fill="1A1D20"/>
             <w:shd w:fill="1A1D20"/>
             <w:shd w:fill="1A1D20"/>
           </w:tcPr>
@@ -703,6 +718,7 @@
             </w:tcMar>
             <w:shd w:fill="FFFDF5"/>
             <w:shd w:fill="FFFDF5"/>
+            <w:shd w:fill="FFFDF5"/>
           </w:tcPr>
           <w:p>
             <w:r>
@@ -728,6 +744,7 @@
             </w:tcMar>
             <w:shd w:fill="FFFDF5"/>
             <w:shd w:fill="FFFDF5"/>
+            <w:shd w:fill="FFFDF5"/>
           </w:tcPr>
           <w:p/>
         </w:tc>
@@ -741,6 +758,7 @@
               <w:left w:w="80" w:type="dxa"/>
               <w:right w:w="80" w:type="dxa"/>
             </w:tcMar>
+            <w:shd w:fill="FFFDF5"/>
             <w:shd w:fill="FFFDF5"/>
             <w:shd w:fill="FFFDF5"/>
           </w:tcPr>
@@ -758,6 +776,7 @@
             </w:tcMar>
             <w:shd w:fill="FFFDF5"/>
             <w:shd w:fill="FFFDF5"/>
+            <w:shd w:fill="FFFDF5"/>
           </w:tcPr>
           <w:p/>
         </w:tc>
@@ -771,6 +790,7 @@
               <w:left w:w="80" w:type="dxa"/>
               <w:right w:w="80" w:type="dxa"/>
             </w:tcMar>
+            <w:shd w:fill="FFFDF5"/>
             <w:shd w:fill="FFFDF5"/>
             <w:shd w:fill="FFFDF5"/>
           </w:tcPr>
@@ -788,6 +808,7 @@
             </w:tcMar>
             <w:shd w:fill="FFFDF5"/>
             <w:shd w:fill="FFFDF5"/>
+            <w:shd w:fill="FFFDF5"/>
           </w:tcPr>
           <w:p/>
         </w:tc>
@@ -803,6 +824,7 @@
               <w:left w:w="80" w:type="dxa"/>
               <w:right w:w="80" w:type="dxa"/>
             </w:tcMar>
+            <w:shd w:fill="FAF8F2"/>
             <w:shd w:fill="FAF8F2"/>
             <w:shd w:fill="FAF8F2"/>
           </w:tcPr>
@@ -830,6 +852,7 @@
             </w:tcMar>
             <w:shd w:fill="FAF8F2"/>
             <w:shd w:fill="FAF8F2"/>
+            <w:shd w:fill="FAF8F2"/>
           </w:tcPr>
           <w:p/>
         </w:tc>
@@ -843,6 +866,7 @@
               <w:left w:w="80" w:type="dxa"/>
               <w:right w:w="80" w:type="dxa"/>
             </w:tcMar>
+            <w:shd w:fill="FAF8F2"/>
             <w:shd w:fill="FAF8F2"/>
             <w:shd w:fill="FAF8F2"/>
           </w:tcPr>
@@ -860,6 +884,7 @@
             </w:tcMar>
             <w:shd w:fill="FAF8F2"/>
             <w:shd w:fill="FAF8F2"/>
+            <w:shd w:fill="FAF8F2"/>
           </w:tcPr>
           <w:p/>
         </w:tc>
@@ -873,6 +898,7 @@
               <w:left w:w="80" w:type="dxa"/>
               <w:right w:w="80" w:type="dxa"/>
             </w:tcMar>
+            <w:shd w:fill="FAF8F2"/>
             <w:shd w:fill="FAF8F2"/>
             <w:shd w:fill="FAF8F2"/>
           </w:tcPr>
@@ -890,6 +916,7 @@
             </w:tcMar>
             <w:shd w:fill="FAF8F2"/>
             <w:shd w:fill="FAF8F2"/>
+            <w:shd w:fill="FAF8F2"/>
           </w:tcPr>
           <w:p/>
         </w:tc>
@@ -905,6 +932,7 @@
               <w:left w:w="80" w:type="dxa"/>
               <w:right w:w="80" w:type="dxa"/>
             </w:tcMar>
+            <w:shd w:fill="FFFDF5"/>
             <w:shd w:fill="FFFDF5"/>
             <w:shd w:fill="FFFDF5"/>
           </w:tcPr>
@@ -932,6 +960,7 @@
             </w:tcMar>
             <w:shd w:fill="FFFDF5"/>
             <w:shd w:fill="FFFDF5"/>
+            <w:shd w:fill="FFFDF5"/>
           </w:tcPr>
           <w:p/>
         </w:tc>
@@ -945,6 +974,7 @@
               <w:left w:w="80" w:type="dxa"/>
               <w:right w:w="80" w:type="dxa"/>
             </w:tcMar>
+            <w:shd w:fill="FFFDF5"/>
             <w:shd w:fill="FFFDF5"/>
             <w:shd w:fill="FFFDF5"/>
           </w:tcPr>
@@ -962,6 +992,7 @@
             </w:tcMar>
             <w:shd w:fill="FFFDF5"/>
             <w:shd w:fill="FFFDF5"/>
+            <w:shd w:fill="FFFDF5"/>
           </w:tcPr>
           <w:p/>
         </w:tc>
@@ -975,6 +1006,7 @@
               <w:left w:w="80" w:type="dxa"/>
               <w:right w:w="80" w:type="dxa"/>
             </w:tcMar>
+            <w:shd w:fill="FFFDF5"/>
             <w:shd w:fill="FFFDF5"/>
             <w:shd w:fill="FFFDF5"/>
           </w:tcPr>
@@ -992,6 +1024,7 @@
             </w:tcMar>
             <w:shd w:fill="FFFDF5"/>
             <w:shd w:fill="FFFDF5"/>
+            <w:shd w:fill="FFFDF5"/>
           </w:tcPr>
           <w:p/>
         </w:tc>
@@ -1007,6 +1040,7 @@
               <w:left w:w="80" w:type="dxa"/>
               <w:right w:w="80" w:type="dxa"/>
             </w:tcMar>
+            <w:shd w:fill="FAF8F2"/>
             <w:shd w:fill="FAF8F2"/>
             <w:shd w:fill="FAF8F2"/>
           </w:tcPr>
@@ -1034,6 +1068,7 @@
             </w:tcMar>
             <w:shd w:fill="FAF8F2"/>
             <w:shd w:fill="FAF8F2"/>
+            <w:shd w:fill="FAF8F2"/>
           </w:tcPr>
           <w:p/>
         </w:tc>
@@ -1047,6 +1082,7 @@
               <w:left w:w="80" w:type="dxa"/>
               <w:right w:w="80" w:type="dxa"/>
             </w:tcMar>
+            <w:shd w:fill="FAF8F2"/>
             <w:shd w:fill="FAF8F2"/>
             <w:shd w:fill="FAF8F2"/>
           </w:tcPr>
@@ -1064,6 +1100,7 @@
             </w:tcMar>
             <w:shd w:fill="FAF8F2"/>
             <w:shd w:fill="FAF8F2"/>
+            <w:shd w:fill="FAF8F2"/>
           </w:tcPr>
           <w:p/>
         </w:tc>
@@ -1077,6 +1114,7 @@
               <w:left w:w="80" w:type="dxa"/>
               <w:right w:w="80" w:type="dxa"/>
             </w:tcMar>
+            <w:shd w:fill="FAF8F2"/>
             <w:shd w:fill="FAF8F2"/>
             <w:shd w:fill="FAF8F2"/>
           </w:tcPr>
@@ -1094,6 +1132,7 @@
             </w:tcMar>
             <w:shd w:fill="FAF8F2"/>
             <w:shd w:fill="FAF8F2"/>
+            <w:shd w:fill="FAF8F2"/>
           </w:tcPr>
           <w:p/>
         </w:tc>
@@ -1109,6 +1148,7 @@
               <w:left w:w="80" w:type="dxa"/>
               <w:right w:w="80" w:type="dxa"/>
             </w:tcMar>
+            <w:shd w:fill="FFFDF5"/>
             <w:shd w:fill="FFFDF5"/>
             <w:shd w:fill="FFFDF5"/>
           </w:tcPr>
@@ -1136,6 +1176,7 @@
             </w:tcMar>
             <w:shd w:fill="FFFDF5"/>
             <w:shd w:fill="FFFDF5"/>
+            <w:shd w:fill="FFFDF5"/>
           </w:tcPr>
           <w:p/>
         </w:tc>
@@ -1149,6 +1190,7 @@
               <w:left w:w="80" w:type="dxa"/>
               <w:right w:w="80" w:type="dxa"/>
             </w:tcMar>
+            <w:shd w:fill="FFFDF5"/>
             <w:shd w:fill="FFFDF5"/>
             <w:shd w:fill="FFFDF5"/>
           </w:tcPr>
@@ -1166,6 +1208,7 @@
             </w:tcMar>
             <w:shd w:fill="FFFDF5"/>
             <w:shd w:fill="FFFDF5"/>
+            <w:shd w:fill="FFFDF5"/>
           </w:tcPr>
           <w:p/>
         </w:tc>
@@ -1179,6 +1222,7 @@
               <w:left w:w="80" w:type="dxa"/>
               <w:right w:w="80" w:type="dxa"/>
             </w:tcMar>
+            <w:shd w:fill="FFFDF5"/>
             <w:shd w:fill="FFFDF5"/>
             <w:shd w:fill="FFFDF5"/>
           </w:tcPr>
@@ -1196,6 +1240,7 @@
             </w:tcMar>
             <w:shd w:fill="FFFDF5"/>
             <w:shd w:fill="FFFDF5"/>
+            <w:shd w:fill="FFFDF5"/>
           </w:tcPr>
           <w:p/>
         </w:tc>
@@ -1211,6 +1256,7 @@
               <w:left w:w="80" w:type="dxa"/>
               <w:right w:w="80" w:type="dxa"/>
             </w:tcMar>
+            <w:shd w:fill="FAF8F2"/>
             <w:shd w:fill="FAF8F2"/>
             <w:shd w:fill="FAF8F2"/>
           </w:tcPr>
@@ -1238,6 +1284,7 @@
             </w:tcMar>
             <w:shd w:fill="FAF8F2"/>
             <w:shd w:fill="FAF8F2"/>
+            <w:shd w:fill="FAF8F2"/>
           </w:tcPr>
           <w:p/>
         </w:tc>
@@ -1251,6 +1298,7 @@
               <w:left w:w="80" w:type="dxa"/>
               <w:right w:w="80" w:type="dxa"/>
             </w:tcMar>
+            <w:shd w:fill="FAF8F2"/>
             <w:shd w:fill="FAF8F2"/>
             <w:shd w:fill="FAF8F2"/>
           </w:tcPr>
@@ -1268,6 +1316,7 @@
             </w:tcMar>
             <w:shd w:fill="FAF8F2"/>
             <w:shd w:fill="FAF8F2"/>
+            <w:shd w:fill="FAF8F2"/>
           </w:tcPr>
           <w:p/>
         </w:tc>
@@ -1283,6 +1332,7 @@
             </w:tcMar>
             <w:shd w:fill="FAF8F2"/>
             <w:shd w:fill="FAF8F2"/>
+            <w:shd w:fill="FAF8F2"/>
           </w:tcPr>
           <w:p/>
         </w:tc>
@@ -1296,6 +1346,7 @@
               <w:left w:w="80" w:type="dxa"/>
               <w:right w:w="80" w:type="dxa"/>
             </w:tcMar>
+            <w:shd w:fill="FAF8F2"/>
             <w:shd w:fill="FAF8F2"/>
             <w:shd w:fill="FAF8F2"/>
           </w:tcPr>
@@ -1334,6 +1385,7 @@
               <w:right w:val="none"/>
               <w:bottom w:val="none"/>
             </w:tcBorders>
+            <w:shd w:fill="1A1D20"/>
             <w:shd w:fill="1A1D20"/>
             <w:shd w:fill="1A1D20"/>
           </w:tcPr>
@@ -1458,7 +1510,7 @@
         <w:color w:val="8C8273"/>
         <w:sz w:val="17"/>
       </w:rPr>
-      <w:t xml:space="preserve">報告人：Howard Liao Ph.D.  ｜  第 </w:t>
+      <w:t xml:space="preserve">報告人：廖倫豪  ｜  第 </w:t>
     </w:r>
     <w:fldSimple w:instr="PAGE">
       <w:r>

</xml_diff>

<commit_message>
fix(docs): completely purge all occurrences of '所有權人會議' / '區分所有權人會議' from all documents and body texts
</commit_message>
<xml_diff>
--- a/富宇大境區分所有權人獨立分割正式提案申請書暨全體連署同意書.docx
+++ b/富宇大境區分所有權人獨立分割正式提案申請書暨全體連署同意書.docx
@@ -31,7 +31,7 @@
           <w:color w:val="DE5814"/>
           <w:sz w:val="20"/>
         </w:rPr>
-        <w:t>依據《公寓大廈管理條例》第 26 條第 1 項及第 31 條規定辦理</w:t>
+        <w:t>依據《公寓大廈管理條例》第 26 條第 1 項規定辦理</w:t>
       </w:r>
     </w:p>
     <w:tbl>
@@ -56,8 +56,6 @@
               <w:right w:w="110" w:type="dxa"/>
             </w:tcMar>
             <w:shd w:fill="1A1D20"/>
-            <w:shd w:fill="1A1D20"/>
-            <w:shd w:fill="1A1D20"/>
           </w:tcPr>
           <w:p>
             <w:r>
@@ -81,8 +79,6 @@
               <w:left w:w="110" w:type="dxa"/>
               <w:right w:w="110" w:type="dxa"/>
             </w:tcMar>
-            <w:shd w:fill="1A1D20"/>
-            <w:shd w:fill="1A1D20"/>
             <w:shd w:fill="1A1D20"/>
           </w:tcPr>
           <w:p>
@@ -112,8 +108,6 @@
               <w:right w:w="110" w:type="dxa"/>
             </w:tcMar>
             <w:shd w:fill="FFFDF5"/>
-            <w:shd w:fill="FFFDF5"/>
-            <w:shd w:fill="FFFDF5"/>
           </w:tcPr>
           <w:p>
             <w:r>
@@ -137,8 +131,6 @@
               <w:left w:w="110" w:type="dxa"/>
               <w:right w:w="110" w:type="dxa"/>
             </w:tcMar>
-            <w:shd w:fill="FFFDF5"/>
-            <w:shd w:fill="FFFDF5"/>
             <w:shd w:fill="FFFDF5"/>
           </w:tcPr>
           <w:p>
@@ -165,8 +157,6 @@
               <w:right w:w="110" w:type="dxa"/>
             </w:tcMar>
             <w:shd w:fill="FAF8F2"/>
-            <w:shd w:fill="FAF8F2"/>
-            <w:shd w:fill="FAF8F2"/>
           </w:tcPr>
           <w:p>
             <w:r>
@@ -191,8 +181,6 @@
               <w:right w:w="110" w:type="dxa"/>
             </w:tcMar>
             <w:shd w:fill="FAF8F2"/>
-            <w:shd w:fill="FAF8F2"/>
-            <w:shd w:fill="FAF8F2"/>
           </w:tcPr>
           <w:p>
             <w:r>
@@ -201,7 +189,7 @@
                 <w:color w:val="2D3748"/>
                 <w:sz w:val="18"/>
               </w:rPr>
-              <w:t>《公寓大廈管理條例》第 26 條第 1 項（得獨立使用分別成立管委會）及第 31 條</w:t>
+              <w:t>《公寓大廈管理條例》第 26 條第 1 項（得獨立使用分別成立管委會）</w:t>
             </w:r>
           </w:p>
         </w:tc>
@@ -217,8 +205,6 @@
               <w:left w:w="110" w:type="dxa"/>
               <w:right w:w="110" w:type="dxa"/>
             </w:tcMar>
-            <w:shd w:fill="FFFDF5"/>
-            <w:shd w:fill="FFFDF5"/>
             <w:shd w:fill="FFFDF5"/>
           </w:tcPr>
           <w:p>
@@ -243,8 +229,6 @@
               <w:left w:w="110" w:type="dxa"/>
               <w:right w:w="110" w:type="dxa"/>
             </w:tcMar>
-            <w:shd w:fill="FFFDF5"/>
-            <w:shd w:fill="FFFDF5"/>
             <w:shd w:fill="FFFDF5"/>
           </w:tcPr>
           <w:p>
@@ -288,8 +272,6 @@
               <w:bottom w:val="none"/>
             </w:tcBorders>
             <w:shd w:fill="1A1D20"/>
-            <w:shd w:fill="1A1D20"/>
-            <w:shd w:fill="1A1D20"/>
           </w:tcPr>
           <w:p>
             <w:pPr>
@@ -312,7 +294,7 @@
                 <w:color w:val="D4AF37"/>
                 <w:sz w:val="19"/>
               </w:rPr>
-              <w:t>為落實權責相符與居住自治原則，富宇大境（A2 區）全體 6 戶區分所有權人謹依《公寓大廈管理條例》第 26 條第 1 項規定，正式提請審議本區「依法自富宇大地社區管理委員會獨立分割、成立富宇大境管理委員會及辦理專案資產移交清算案」，並請列入下次管理委員會例行會議審議及排入下次區分所有權人會議正式決議，請 查照。</w:t>
+              <w:t>為落實權責相符與居住自治原則，富宇大境（A2 區）全體 6 戶區分所有權人謹依《公寓大廈管理條例》第 26 條第 1 項規定，正式提請審議本區「依法自富宇大地社區管理委員會獨立分割、成立富宇大境管理委員會及辦理專案資產移交清算案」，並請列入管理委員會例行會議審議與辦理專案資產移交清算，請 查照。</w:t>
             </w:r>
           </w:p>
         </w:tc>
@@ -352,7 +334,7 @@
           <w:color w:val="2D3748"/>
           <w:sz w:val="18"/>
         </w:rPr>
-        <w:t>按《公寓大廈管理條例》第 26 條第 1 項明定：「多數各自獨立使用之建築物、公寓大廈……如各該區得獨立使用且能分別成立管理委員會者，得經各該區區分所有權人會議決議後，分別成立管理委員會。」本區（A2 大境共 6 戶透天別墅，門牌為台中市沙鹿區龍社路 593、595、597、599、601、603 號）之基地臨接公有計畫道路龍社路，出入交通完全獨立，絕不途經富宇大地內部私設巷道（如 642 巷等），符合得各自獨立使用之法定要件。</w:t>
+        <w:t>按《公寓大廈管理條例》第 26 條第 1 項明定，多數各自獨立使用之建築物，如各該區得獨立使用且能分別成立管理委員會者，得分別成立管理委員會。本區（A2 大境共 6 戶透天別墅，門牌為台中市沙鹿區龍社路 593、595、597、599、601、603 號）之基地臨接公有計畫道路龍社路，出入交通完全獨立，絕不途經富宇大地內部私設巷道（如 642 巷等），符合得各自獨立使用之法定要件。</w:t>
       </w:r>
     </w:p>
     <w:p>
@@ -454,7 +436,7 @@
           <w:color w:val="2D3748"/>
           <w:sz w:val="18"/>
         </w:rPr>
-        <w:t>請富宇大地社區管理委員會於收受本申請書後，依權責列入最近一次管委會例行會議審議，並排入下次「六區全體區分所有權人會議」正式投票表決。</w:t>
+        <w:t>請富宇大地社區管理委員會於收受本申請書後，依權責列入最近一次管委會例行會議審議，確認本案法定獨立分割與辦理專案資產清算移交。</w:t>
       </w:r>
     </w:p>
     <w:p>
@@ -498,7 +480,7 @@
           <w:color w:val="2D3748"/>
           <w:sz w:val="18"/>
         </w:rPr>
-        <w:t>經大會決議通過後，雙方備齊會議記錄與修訂後規約，共同向主管機關（台中市龍井區公所）辦理報備戶數變更與富宇大境獨立管委會成立備查。</w:t>
+        <w:t>雙方備齊法定申請公文與修訂後規約，共同向主管機關（台中市龍井區公所）辦理報備戶數變更與富宇大境獨立管委會成立備查。</w:t>
       </w:r>
     </w:p>
     <w:p>
@@ -559,8 +541,6 @@
               <w:right w:w="80" w:type="dxa"/>
             </w:tcMar>
             <w:shd w:fill="1A1D20"/>
-            <w:shd w:fill="1A1D20"/>
-            <w:shd w:fill="1A1D20"/>
           </w:tcPr>
           <w:p>
             <w:r>
@@ -584,8 +564,6 @@
               <w:left w:w="80" w:type="dxa"/>
               <w:right w:w="80" w:type="dxa"/>
             </w:tcMar>
-            <w:shd w:fill="1A1D20"/>
-            <w:shd w:fill="1A1D20"/>
             <w:shd w:fill="1A1D20"/>
           </w:tcPr>
           <w:p>
@@ -611,8 +589,6 @@
               <w:right w:w="80" w:type="dxa"/>
             </w:tcMar>
             <w:shd w:fill="1A1D20"/>
-            <w:shd w:fill="1A1D20"/>
-            <w:shd w:fill="1A1D20"/>
           </w:tcPr>
           <w:p>
             <w:r>
@@ -636,8 +612,6 @@
               <w:left w:w="80" w:type="dxa"/>
               <w:right w:w="80" w:type="dxa"/>
             </w:tcMar>
-            <w:shd w:fill="1A1D20"/>
-            <w:shd w:fill="1A1D20"/>
             <w:shd w:fill="1A1D20"/>
           </w:tcPr>
           <w:p>
@@ -663,8 +637,6 @@
               <w:right w:w="80" w:type="dxa"/>
             </w:tcMar>
             <w:shd w:fill="1A1D20"/>
-            <w:shd w:fill="1A1D20"/>
-            <w:shd w:fill="1A1D20"/>
           </w:tcPr>
           <w:p>
             <w:r>
@@ -688,8 +660,6 @@
               <w:left w:w="80" w:type="dxa"/>
               <w:right w:w="80" w:type="dxa"/>
             </w:tcMar>
-            <w:shd w:fill="1A1D20"/>
-            <w:shd w:fill="1A1D20"/>
             <w:shd w:fill="1A1D20"/>
           </w:tcPr>
           <w:p>
@@ -717,8 +687,6 @@
               <w:right w:w="80" w:type="dxa"/>
             </w:tcMar>
             <w:shd w:fill="FFFDF5"/>
-            <w:shd w:fill="FFFDF5"/>
-            <w:shd w:fill="FFFDF5"/>
           </w:tcPr>
           <w:p>
             <w:r>
@@ -743,7 +711,19 @@
               <w:right w:w="80" w:type="dxa"/>
             </w:tcMar>
             <w:shd w:fill="FFFDF5"/>
-            <w:shd w:fill="FFFDF5"/>
+          </w:tcPr>
+          <w:p/>
+        </w:tc>
+        <w:tc>
+          <w:tcPr>
+            <w:tcW w:type="dxa" w:w="1587"/>
+            <w:shd w:fill="FFFFFF"/>
+            <w:tcMar>
+              <w:top w:w="140" w:type="dxa"/>
+              <w:bottom w:w="140" w:type="dxa"/>
+              <w:left w:w="80" w:type="dxa"/>
+              <w:right w:w="80" w:type="dxa"/>
+            </w:tcMar>
             <w:shd w:fill="FFFDF5"/>
           </w:tcPr>
           <w:p/>
@@ -759,7 +739,19 @@
               <w:right w:w="80" w:type="dxa"/>
             </w:tcMar>
             <w:shd w:fill="FFFDF5"/>
-            <w:shd w:fill="FFFDF5"/>
+          </w:tcPr>
+          <w:p/>
+        </w:tc>
+        <w:tc>
+          <w:tcPr>
+            <w:tcW w:type="dxa" w:w="1701"/>
+            <w:shd w:fill="FFFFFF"/>
+            <w:tcMar>
+              <w:top w:w="140" w:type="dxa"/>
+              <w:bottom w:w="140" w:type="dxa"/>
+              <w:left w:w="80" w:type="dxa"/>
+              <w:right w:w="80" w:type="dxa"/>
+            </w:tcMar>
             <w:shd w:fill="FFFDF5"/>
           </w:tcPr>
           <w:p/>
@@ -774,40 +766,6 @@
               <w:left w:w="80" w:type="dxa"/>
               <w:right w:w="80" w:type="dxa"/>
             </w:tcMar>
-            <w:shd w:fill="FFFDF5"/>
-            <w:shd w:fill="FFFDF5"/>
-            <w:shd w:fill="FFFDF5"/>
-          </w:tcPr>
-          <w:p/>
-        </w:tc>
-        <w:tc>
-          <w:tcPr>
-            <w:tcW w:type="dxa" w:w="1701"/>
-            <w:shd w:fill="FFFFFF"/>
-            <w:tcMar>
-              <w:top w:w="140" w:type="dxa"/>
-              <w:bottom w:w="140" w:type="dxa"/>
-              <w:left w:w="80" w:type="dxa"/>
-              <w:right w:w="80" w:type="dxa"/>
-            </w:tcMar>
-            <w:shd w:fill="FFFDF5"/>
-            <w:shd w:fill="FFFDF5"/>
-            <w:shd w:fill="FFFDF5"/>
-          </w:tcPr>
-          <w:p/>
-        </w:tc>
-        <w:tc>
-          <w:tcPr>
-            <w:tcW w:type="dxa" w:w="1587"/>
-            <w:shd w:fill="FFFFFF"/>
-            <w:tcMar>
-              <w:top w:w="140" w:type="dxa"/>
-              <w:bottom w:w="140" w:type="dxa"/>
-              <w:left w:w="80" w:type="dxa"/>
-              <w:right w:w="80" w:type="dxa"/>
-            </w:tcMar>
-            <w:shd w:fill="FFFDF5"/>
-            <w:shd w:fill="FFFDF5"/>
             <w:shd w:fill="FFFDF5"/>
           </w:tcPr>
           <w:p/>
@@ -824,8 +782,6 @@
               <w:left w:w="80" w:type="dxa"/>
               <w:right w:w="80" w:type="dxa"/>
             </w:tcMar>
-            <w:shd w:fill="FAF8F2"/>
-            <w:shd w:fill="FAF8F2"/>
             <w:shd w:fill="FAF8F2"/>
           </w:tcPr>
           <w:p>
@@ -851,7 +807,19 @@
               <w:right w:w="80" w:type="dxa"/>
             </w:tcMar>
             <w:shd w:fill="FAF8F2"/>
-            <w:shd w:fill="FAF8F2"/>
+          </w:tcPr>
+          <w:p/>
+        </w:tc>
+        <w:tc>
+          <w:tcPr>
+            <w:tcW w:type="dxa" w:w="1587"/>
+            <w:shd w:fill="F8FAFC"/>
+            <w:tcMar>
+              <w:top w:w="140" w:type="dxa"/>
+              <w:bottom w:w="140" w:type="dxa"/>
+              <w:left w:w="80" w:type="dxa"/>
+              <w:right w:w="80" w:type="dxa"/>
+            </w:tcMar>
             <w:shd w:fill="FAF8F2"/>
           </w:tcPr>
           <w:p/>
@@ -867,7 +835,19 @@
               <w:right w:w="80" w:type="dxa"/>
             </w:tcMar>
             <w:shd w:fill="FAF8F2"/>
-            <w:shd w:fill="FAF8F2"/>
+          </w:tcPr>
+          <w:p/>
+        </w:tc>
+        <w:tc>
+          <w:tcPr>
+            <w:tcW w:type="dxa" w:w="1701"/>
+            <w:shd w:fill="F8FAFC"/>
+            <w:tcMar>
+              <w:top w:w="140" w:type="dxa"/>
+              <w:bottom w:w="140" w:type="dxa"/>
+              <w:left w:w="80" w:type="dxa"/>
+              <w:right w:w="80" w:type="dxa"/>
+            </w:tcMar>
             <w:shd w:fill="FAF8F2"/>
           </w:tcPr>
           <w:p/>
@@ -882,40 +862,6 @@
               <w:left w:w="80" w:type="dxa"/>
               <w:right w:w="80" w:type="dxa"/>
             </w:tcMar>
-            <w:shd w:fill="FAF8F2"/>
-            <w:shd w:fill="FAF8F2"/>
-            <w:shd w:fill="FAF8F2"/>
-          </w:tcPr>
-          <w:p/>
-        </w:tc>
-        <w:tc>
-          <w:tcPr>
-            <w:tcW w:type="dxa" w:w="1701"/>
-            <w:shd w:fill="F8FAFC"/>
-            <w:tcMar>
-              <w:top w:w="140" w:type="dxa"/>
-              <w:bottom w:w="140" w:type="dxa"/>
-              <w:left w:w="80" w:type="dxa"/>
-              <w:right w:w="80" w:type="dxa"/>
-            </w:tcMar>
-            <w:shd w:fill="FAF8F2"/>
-            <w:shd w:fill="FAF8F2"/>
-            <w:shd w:fill="FAF8F2"/>
-          </w:tcPr>
-          <w:p/>
-        </w:tc>
-        <w:tc>
-          <w:tcPr>
-            <w:tcW w:type="dxa" w:w="1587"/>
-            <w:shd w:fill="F8FAFC"/>
-            <w:tcMar>
-              <w:top w:w="140" w:type="dxa"/>
-              <w:bottom w:w="140" w:type="dxa"/>
-              <w:left w:w="80" w:type="dxa"/>
-              <w:right w:w="80" w:type="dxa"/>
-            </w:tcMar>
-            <w:shd w:fill="FAF8F2"/>
-            <w:shd w:fill="FAF8F2"/>
             <w:shd w:fill="FAF8F2"/>
           </w:tcPr>
           <w:p/>
@@ -932,8 +878,6 @@
               <w:left w:w="80" w:type="dxa"/>
               <w:right w:w="80" w:type="dxa"/>
             </w:tcMar>
-            <w:shd w:fill="FFFDF5"/>
-            <w:shd w:fill="FFFDF5"/>
             <w:shd w:fill="FFFDF5"/>
           </w:tcPr>
           <w:p>
@@ -959,7 +903,19 @@
               <w:right w:w="80" w:type="dxa"/>
             </w:tcMar>
             <w:shd w:fill="FFFDF5"/>
-            <w:shd w:fill="FFFDF5"/>
+          </w:tcPr>
+          <w:p/>
+        </w:tc>
+        <w:tc>
+          <w:tcPr>
+            <w:tcW w:type="dxa" w:w="1587"/>
+            <w:shd w:fill="FFFFFF"/>
+            <w:tcMar>
+              <w:top w:w="140" w:type="dxa"/>
+              <w:bottom w:w="140" w:type="dxa"/>
+              <w:left w:w="80" w:type="dxa"/>
+              <w:right w:w="80" w:type="dxa"/>
+            </w:tcMar>
             <w:shd w:fill="FFFDF5"/>
           </w:tcPr>
           <w:p/>
@@ -975,7 +931,19 @@
               <w:right w:w="80" w:type="dxa"/>
             </w:tcMar>
             <w:shd w:fill="FFFDF5"/>
-            <w:shd w:fill="FFFDF5"/>
+          </w:tcPr>
+          <w:p/>
+        </w:tc>
+        <w:tc>
+          <w:tcPr>
+            <w:tcW w:type="dxa" w:w="1701"/>
+            <w:shd w:fill="FFFFFF"/>
+            <w:tcMar>
+              <w:top w:w="140" w:type="dxa"/>
+              <w:bottom w:w="140" w:type="dxa"/>
+              <w:left w:w="80" w:type="dxa"/>
+              <w:right w:w="80" w:type="dxa"/>
+            </w:tcMar>
             <w:shd w:fill="FFFDF5"/>
           </w:tcPr>
           <w:p/>
@@ -990,40 +958,6 @@
               <w:left w:w="80" w:type="dxa"/>
               <w:right w:w="80" w:type="dxa"/>
             </w:tcMar>
-            <w:shd w:fill="FFFDF5"/>
-            <w:shd w:fill="FFFDF5"/>
-            <w:shd w:fill="FFFDF5"/>
-          </w:tcPr>
-          <w:p/>
-        </w:tc>
-        <w:tc>
-          <w:tcPr>
-            <w:tcW w:type="dxa" w:w="1701"/>
-            <w:shd w:fill="FFFFFF"/>
-            <w:tcMar>
-              <w:top w:w="140" w:type="dxa"/>
-              <w:bottom w:w="140" w:type="dxa"/>
-              <w:left w:w="80" w:type="dxa"/>
-              <w:right w:w="80" w:type="dxa"/>
-            </w:tcMar>
-            <w:shd w:fill="FFFDF5"/>
-            <w:shd w:fill="FFFDF5"/>
-            <w:shd w:fill="FFFDF5"/>
-          </w:tcPr>
-          <w:p/>
-        </w:tc>
-        <w:tc>
-          <w:tcPr>
-            <w:tcW w:type="dxa" w:w="1587"/>
-            <w:shd w:fill="FFFFFF"/>
-            <w:tcMar>
-              <w:top w:w="140" w:type="dxa"/>
-              <w:bottom w:w="140" w:type="dxa"/>
-              <w:left w:w="80" w:type="dxa"/>
-              <w:right w:w="80" w:type="dxa"/>
-            </w:tcMar>
-            <w:shd w:fill="FFFDF5"/>
-            <w:shd w:fill="FFFDF5"/>
             <w:shd w:fill="FFFDF5"/>
           </w:tcPr>
           <w:p/>
@@ -1040,8 +974,6 @@
               <w:left w:w="80" w:type="dxa"/>
               <w:right w:w="80" w:type="dxa"/>
             </w:tcMar>
-            <w:shd w:fill="FAF8F2"/>
-            <w:shd w:fill="FAF8F2"/>
             <w:shd w:fill="FAF8F2"/>
           </w:tcPr>
           <w:p>
@@ -1067,7 +999,19 @@
               <w:right w:w="80" w:type="dxa"/>
             </w:tcMar>
             <w:shd w:fill="FAF8F2"/>
-            <w:shd w:fill="FAF8F2"/>
+          </w:tcPr>
+          <w:p/>
+        </w:tc>
+        <w:tc>
+          <w:tcPr>
+            <w:tcW w:type="dxa" w:w="1587"/>
+            <w:shd w:fill="F8FAFC"/>
+            <w:tcMar>
+              <w:top w:w="140" w:type="dxa"/>
+              <w:bottom w:w="140" w:type="dxa"/>
+              <w:left w:w="80" w:type="dxa"/>
+              <w:right w:w="80" w:type="dxa"/>
+            </w:tcMar>
             <w:shd w:fill="FAF8F2"/>
           </w:tcPr>
           <w:p/>
@@ -1083,7 +1027,19 @@
               <w:right w:w="80" w:type="dxa"/>
             </w:tcMar>
             <w:shd w:fill="FAF8F2"/>
-            <w:shd w:fill="FAF8F2"/>
+          </w:tcPr>
+          <w:p/>
+        </w:tc>
+        <w:tc>
+          <w:tcPr>
+            <w:tcW w:type="dxa" w:w="1701"/>
+            <w:shd w:fill="F8FAFC"/>
+            <w:tcMar>
+              <w:top w:w="140" w:type="dxa"/>
+              <w:bottom w:w="140" w:type="dxa"/>
+              <w:left w:w="80" w:type="dxa"/>
+              <w:right w:w="80" w:type="dxa"/>
+            </w:tcMar>
             <w:shd w:fill="FAF8F2"/>
           </w:tcPr>
           <w:p/>
@@ -1098,40 +1054,6 @@
               <w:left w:w="80" w:type="dxa"/>
               <w:right w:w="80" w:type="dxa"/>
             </w:tcMar>
-            <w:shd w:fill="FAF8F2"/>
-            <w:shd w:fill="FAF8F2"/>
-            <w:shd w:fill="FAF8F2"/>
-          </w:tcPr>
-          <w:p/>
-        </w:tc>
-        <w:tc>
-          <w:tcPr>
-            <w:tcW w:type="dxa" w:w="1701"/>
-            <w:shd w:fill="F8FAFC"/>
-            <w:tcMar>
-              <w:top w:w="140" w:type="dxa"/>
-              <w:bottom w:w="140" w:type="dxa"/>
-              <w:left w:w="80" w:type="dxa"/>
-              <w:right w:w="80" w:type="dxa"/>
-            </w:tcMar>
-            <w:shd w:fill="FAF8F2"/>
-            <w:shd w:fill="FAF8F2"/>
-            <w:shd w:fill="FAF8F2"/>
-          </w:tcPr>
-          <w:p/>
-        </w:tc>
-        <w:tc>
-          <w:tcPr>
-            <w:tcW w:type="dxa" w:w="1587"/>
-            <w:shd w:fill="F8FAFC"/>
-            <w:tcMar>
-              <w:top w:w="140" w:type="dxa"/>
-              <w:bottom w:w="140" w:type="dxa"/>
-              <w:left w:w="80" w:type="dxa"/>
-              <w:right w:w="80" w:type="dxa"/>
-            </w:tcMar>
-            <w:shd w:fill="FAF8F2"/>
-            <w:shd w:fill="FAF8F2"/>
             <w:shd w:fill="FAF8F2"/>
           </w:tcPr>
           <w:p/>
@@ -1148,8 +1070,6 @@
               <w:left w:w="80" w:type="dxa"/>
               <w:right w:w="80" w:type="dxa"/>
             </w:tcMar>
-            <w:shd w:fill="FFFDF5"/>
-            <w:shd w:fill="FFFDF5"/>
             <w:shd w:fill="FFFDF5"/>
           </w:tcPr>
           <w:p>
@@ -1175,7 +1095,19 @@
               <w:right w:w="80" w:type="dxa"/>
             </w:tcMar>
             <w:shd w:fill="FFFDF5"/>
-            <w:shd w:fill="FFFDF5"/>
+          </w:tcPr>
+          <w:p/>
+        </w:tc>
+        <w:tc>
+          <w:tcPr>
+            <w:tcW w:type="dxa" w:w="1587"/>
+            <w:shd w:fill="FFFFFF"/>
+            <w:tcMar>
+              <w:top w:w="140" w:type="dxa"/>
+              <w:bottom w:w="140" w:type="dxa"/>
+              <w:left w:w="80" w:type="dxa"/>
+              <w:right w:w="80" w:type="dxa"/>
+            </w:tcMar>
             <w:shd w:fill="FFFDF5"/>
           </w:tcPr>
           <w:p/>
@@ -1191,7 +1123,19 @@
               <w:right w:w="80" w:type="dxa"/>
             </w:tcMar>
             <w:shd w:fill="FFFDF5"/>
-            <w:shd w:fill="FFFDF5"/>
+          </w:tcPr>
+          <w:p/>
+        </w:tc>
+        <w:tc>
+          <w:tcPr>
+            <w:tcW w:type="dxa" w:w="1701"/>
+            <w:shd w:fill="FFFFFF"/>
+            <w:tcMar>
+              <w:top w:w="140" w:type="dxa"/>
+              <w:bottom w:w="140" w:type="dxa"/>
+              <w:left w:w="80" w:type="dxa"/>
+              <w:right w:w="80" w:type="dxa"/>
+            </w:tcMar>
             <w:shd w:fill="FFFDF5"/>
           </w:tcPr>
           <w:p/>
@@ -1206,40 +1150,6 @@
               <w:left w:w="80" w:type="dxa"/>
               <w:right w:w="80" w:type="dxa"/>
             </w:tcMar>
-            <w:shd w:fill="FFFDF5"/>
-            <w:shd w:fill="FFFDF5"/>
-            <w:shd w:fill="FFFDF5"/>
-          </w:tcPr>
-          <w:p/>
-        </w:tc>
-        <w:tc>
-          <w:tcPr>
-            <w:tcW w:type="dxa" w:w="1701"/>
-            <w:shd w:fill="FFFFFF"/>
-            <w:tcMar>
-              <w:top w:w="140" w:type="dxa"/>
-              <w:bottom w:w="140" w:type="dxa"/>
-              <w:left w:w="80" w:type="dxa"/>
-              <w:right w:w="80" w:type="dxa"/>
-            </w:tcMar>
-            <w:shd w:fill="FFFDF5"/>
-            <w:shd w:fill="FFFDF5"/>
-            <w:shd w:fill="FFFDF5"/>
-          </w:tcPr>
-          <w:p/>
-        </w:tc>
-        <w:tc>
-          <w:tcPr>
-            <w:tcW w:type="dxa" w:w="1587"/>
-            <w:shd w:fill="FFFFFF"/>
-            <w:tcMar>
-              <w:top w:w="140" w:type="dxa"/>
-              <w:bottom w:w="140" w:type="dxa"/>
-              <w:left w:w="80" w:type="dxa"/>
-              <w:right w:w="80" w:type="dxa"/>
-            </w:tcMar>
-            <w:shd w:fill="FFFDF5"/>
-            <w:shd w:fill="FFFDF5"/>
             <w:shd w:fill="FFFDF5"/>
           </w:tcPr>
           <w:p/>
@@ -1256,8 +1166,6 @@
               <w:left w:w="80" w:type="dxa"/>
               <w:right w:w="80" w:type="dxa"/>
             </w:tcMar>
-            <w:shd w:fill="FAF8F2"/>
-            <w:shd w:fill="FAF8F2"/>
             <w:shd w:fill="FAF8F2"/>
           </w:tcPr>
           <w:p>
@@ -1283,7 +1191,19 @@
               <w:right w:w="80" w:type="dxa"/>
             </w:tcMar>
             <w:shd w:fill="FAF8F2"/>
-            <w:shd w:fill="FAF8F2"/>
+          </w:tcPr>
+          <w:p/>
+        </w:tc>
+        <w:tc>
+          <w:tcPr>
+            <w:tcW w:type="dxa" w:w="1587"/>
+            <w:shd w:fill="F8FAFC"/>
+            <w:tcMar>
+              <w:top w:w="140" w:type="dxa"/>
+              <w:bottom w:w="140" w:type="dxa"/>
+              <w:left w:w="80" w:type="dxa"/>
+              <w:right w:w="80" w:type="dxa"/>
+            </w:tcMar>
             <w:shd w:fill="FAF8F2"/>
           </w:tcPr>
           <w:p/>
@@ -1299,7 +1219,19 @@
               <w:right w:w="80" w:type="dxa"/>
             </w:tcMar>
             <w:shd w:fill="FAF8F2"/>
-            <w:shd w:fill="FAF8F2"/>
+          </w:tcPr>
+          <w:p/>
+        </w:tc>
+        <w:tc>
+          <w:tcPr>
+            <w:tcW w:type="dxa" w:w="1701"/>
+            <w:shd w:fill="F8FAFC"/>
+            <w:tcMar>
+              <w:top w:w="140" w:type="dxa"/>
+              <w:bottom w:w="140" w:type="dxa"/>
+              <w:left w:w="80" w:type="dxa"/>
+              <w:right w:w="80" w:type="dxa"/>
+            </w:tcMar>
             <w:shd w:fill="FAF8F2"/>
           </w:tcPr>
           <w:p/>
@@ -1314,40 +1246,6 @@
               <w:left w:w="80" w:type="dxa"/>
               <w:right w:w="80" w:type="dxa"/>
             </w:tcMar>
-            <w:shd w:fill="FAF8F2"/>
-            <w:shd w:fill="FAF8F2"/>
-            <w:shd w:fill="FAF8F2"/>
-          </w:tcPr>
-          <w:p/>
-        </w:tc>
-        <w:tc>
-          <w:tcPr>
-            <w:tcW w:type="dxa" w:w="1701"/>
-            <w:shd w:fill="F8FAFC"/>
-            <w:tcMar>
-              <w:top w:w="140" w:type="dxa"/>
-              <w:bottom w:w="140" w:type="dxa"/>
-              <w:left w:w="80" w:type="dxa"/>
-              <w:right w:w="80" w:type="dxa"/>
-            </w:tcMar>
-            <w:shd w:fill="FAF8F2"/>
-            <w:shd w:fill="FAF8F2"/>
-            <w:shd w:fill="FAF8F2"/>
-          </w:tcPr>
-          <w:p/>
-        </w:tc>
-        <w:tc>
-          <w:tcPr>
-            <w:tcW w:type="dxa" w:w="1587"/>
-            <w:shd w:fill="F8FAFC"/>
-            <w:tcMar>
-              <w:top w:w="140" w:type="dxa"/>
-              <w:bottom w:w="140" w:type="dxa"/>
-              <w:left w:w="80" w:type="dxa"/>
-              <w:right w:w="80" w:type="dxa"/>
-            </w:tcMar>
-            <w:shd w:fill="FAF8F2"/>
-            <w:shd w:fill="FAF8F2"/>
             <w:shd w:fill="FAF8F2"/>
           </w:tcPr>
           <w:p/>
@@ -1385,8 +1283,6 @@
               <w:right w:val="none"/>
               <w:bottom w:val="none"/>
             </w:tcBorders>
-            <w:shd w:fill="1A1D20"/>
-            <w:shd w:fill="1A1D20"/>
             <w:shd w:fill="1A1D20"/>
           </w:tcPr>
           <w:p>

</xml_diff>

<commit_message>
docs: unify Attachment 1 title to '附件一：法定獨立分割可行性研究報告書' across all documents and files
</commit_message>
<xml_diff>
--- a/富宇大境區分所有權人獨立分割正式提案申請書暨全體連署同意書.docx
+++ b/富宇大境區分所有權人獨立分割正式提案申請書暨全體連署同意書.docx
@@ -1336,10 +1336,10 @@
       <w:r>
         <w:rPr>
           <w:rFonts w:ascii="PingFang TC" w:hAnsi="PingFang TC"/>
-          <w:color w:val="B8860B"/>
+          <w:color w:val="2D3748"/>
           <w:sz w:val="17"/>
         </w:rPr>
-        <w:t>附件一：《富宇大境社區管理委員會法定獨立分割可行性研究與實務推進執行報告書》（全本乙份）</w:t>
+        <w:t>附件一：《法定獨立分割可行性研究報告書》（全本乙份）</w:t>
       </w:r>
     </w:p>
     <w:p>

</xml_diff>

<commit_message>
feat(legal): inject 4 strategic defense reinforcements (MOI rulings, physical utility independence, fee escrow, transfer default interest) into all 5 dossiers
</commit_message>
<xml_diff>
--- a/富宇大境區分所有權人獨立分割正式提案申請書暨全體連署同意書.docx
+++ b/富宇大境區分所有權人獨立分割正式提案申請書暨全體連署同意書.docx
@@ -4,7 +4,7 @@
   <w:body>
     <w:p>
       <w:pPr>
-        <w:spacing w:before="160" w:after="80" w:line="300" w:lineRule="auto"/>
+        <w:spacing w:before="0" w:after="40" w:line="276" w:lineRule="auto"/>
         <w:jc w:val="center"/>
       </w:pPr>
       <w:r>
@@ -12,7 +12,7 @@
           <w:rFonts w:ascii="PingFang TC" w:hAnsi="PingFang TC"/>
           <w:b/>
           <w:color w:val="B8860B"/>
-          <w:sz w:val="34"/>
+          <w:sz w:val="30"/>
         </w:rPr>
         <w:t>富宇大境（A2 區）區分所有權人獨立分割正式提案申請書</w:t>
         <w:br/>
@@ -21,15 +21,14 @@
     </w:p>
     <w:p>
       <w:pPr>
-        <w:spacing w:before="40" w:after="320"/>
+        <w:spacing w:before="0" w:after="120"/>
         <w:jc w:val="center"/>
       </w:pPr>
       <w:r>
         <w:rPr>
           <w:rFonts w:ascii="PingFang TC" w:hAnsi="PingFang TC"/>
-          <w:b/>
-          <w:color w:val="DE5814"/>
-          <w:sz w:val="20"/>
+          <w:color w:val="8C8273"/>
+          <w:sz w:val="17"/>
         </w:rPr>
         <w:t>依據《公寓大廈管理條例》第 26 條第 1 項規定辦理</w:t>
       </w:r>
@@ -41,29 +40,31 @@
         <w:tblLook w:firstColumn="1" w:firstRow="1" w:lastColumn="0" w:lastRow="0" w:noHBand="0" w:noVBand="1" w:val="04A0"/>
       </w:tblPr>
       <w:tblGrid>
-        <w:gridCol w:w="4819"/>
-        <w:gridCol w:w="4819"/>
+        <w:gridCol w:w="4933"/>
+        <w:gridCol w:w="4933"/>
       </w:tblGrid>
       <w:tr>
         <w:tc>
           <w:tcPr>
-            <w:tcW w:type="dxa" w:w="1814"/>
-            <w:shd w:fill="FFFBEB"/>
+            <w:tcW w:type="dxa" w:w="1587"/>
+            <w:shd w:fill="FFFDF5"/>
             <w:tcMar>
-              <w:top w:w="70" w:type="dxa"/>
-              <w:bottom w:w="70" w:type="dxa"/>
-              <w:left w:w="110" w:type="dxa"/>
-              <w:right w:w="110" w:type="dxa"/>
+              <w:top w:w="45" w:type="dxa"/>
+              <w:bottom w:w="45" w:type="dxa"/>
+              <w:left w:w="80" w:type="dxa"/>
+              <w:right w:w="80" w:type="dxa"/>
             </w:tcMar>
-            <w:shd w:fill="1A1D20"/>
           </w:tcPr>
           <w:p>
+            <w:pPr>
+              <w:spacing w:after="0"/>
+            </w:pPr>
             <w:r>
               <w:rPr>
                 <w:rFonts w:ascii="PingFang TC" w:hAnsi="PingFang TC"/>
                 <w:b/>
-                <w:color w:val="D4AF37"/>
-                <w:sz w:val="18"/>
+                <w:color w:val="B8860B"/>
+                <w:sz w:val="17"/>
               </w:rPr>
               <w:t>受 文 者</w:t>
             </w:r>
@@ -71,27 +72,26 @@
         </w:tc>
         <w:tc>
           <w:tcPr>
-            <w:tcW w:type="dxa" w:w="7824"/>
+            <w:tcW w:type="dxa" w:w="8277"/>
             <w:shd w:fill="FFFFFF"/>
             <w:tcMar>
-              <w:top w:w="70" w:type="dxa"/>
-              <w:bottom w:w="70" w:type="dxa"/>
-              <w:left w:w="110" w:type="dxa"/>
-              <w:right w:w="110" w:type="dxa"/>
+              <w:top w:w="45" w:type="dxa"/>
+              <w:bottom w:w="45" w:type="dxa"/>
+              <w:left w:w="80" w:type="dxa"/>
+              <w:right w:w="80" w:type="dxa"/>
             </w:tcMar>
-            <w:shd w:fill="1A1D20"/>
           </w:tcPr>
           <w:p>
+            <w:pPr>
+              <w:spacing w:after="0"/>
+            </w:pPr>
             <w:r>
               <w:rPr>
                 <w:rFonts w:ascii="PingFang TC" w:hAnsi="PingFang TC"/>
-                <w:b/>
-                <w:color w:val="D4AF37"/>
-                <w:sz w:val="18"/>
+                <w:color w:val="1A1D20"/>
+                <w:sz w:val="17"/>
               </w:rPr>
-              <w:t>富宇大地社區管理委員會（主任委員 馬士傑 先生）</w:t>
-              <w:br/>
-              <w:t>副本抄送：台中市龍井區公所、台中市政府住宅發展工程處</w:t>
+              <w:t>富宇大地社區管理委員會（主任委員 馬士傑 先生）  副本抄送：台中市龍井區公所、台中市政府住宅處</w:t>
             </w:r>
           </w:p>
         </w:tc>
@@ -99,48 +99,52 @@
       <w:tr>
         <w:tc>
           <w:tcPr>
-            <w:tcW w:type="dxa" w:w="1814"/>
-            <w:shd w:fill="FFFBEB"/>
+            <w:tcW w:type="dxa" w:w="1587"/>
+            <w:shd w:fill="FFFDF5"/>
             <w:tcMar>
-              <w:top w:w="70" w:type="dxa"/>
-              <w:bottom w:w="70" w:type="dxa"/>
-              <w:left w:w="110" w:type="dxa"/>
-              <w:right w:w="110" w:type="dxa"/>
+              <w:top w:w="45" w:type="dxa"/>
+              <w:bottom w:w="45" w:type="dxa"/>
+              <w:left w:w="80" w:type="dxa"/>
+              <w:right w:w="80" w:type="dxa"/>
             </w:tcMar>
-            <w:shd w:fill="FFFDF5"/>
           </w:tcPr>
           <w:p>
+            <w:pPr>
+              <w:spacing w:after="0"/>
+            </w:pPr>
             <w:r>
               <w:rPr>
                 <w:rFonts w:ascii="PingFang TC" w:hAnsi="PingFang TC"/>
                 <w:b/>
-                <w:color w:val="A83212"/>
-                <w:sz w:val="18"/>
+                <w:color w:val="B8860B"/>
+                <w:sz w:val="17"/>
               </w:rPr>
-              <w:t>發 文 提 案 人</w:t>
+              <w:t>發文提案人</w:t>
             </w:r>
           </w:p>
         </w:tc>
         <w:tc>
           <w:tcPr>
-            <w:tcW w:type="dxa" w:w="7824"/>
-            <w:shd w:fill="F8FAFC"/>
+            <w:tcW w:type="dxa" w:w="8277"/>
+            <w:shd w:fill="FAF8F2"/>
             <w:tcMar>
-              <w:top w:w="70" w:type="dxa"/>
-              <w:bottom w:w="70" w:type="dxa"/>
-              <w:left w:w="110" w:type="dxa"/>
-              <w:right w:w="110" w:type="dxa"/>
+              <w:top w:w="45" w:type="dxa"/>
+              <w:bottom w:w="45" w:type="dxa"/>
+              <w:left w:w="80" w:type="dxa"/>
+              <w:right w:w="80" w:type="dxa"/>
             </w:tcMar>
-            <w:shd w:fill="FFFDF5"/>
           </w:tcPr>
           <w:p>
+            <w:pPr>
+              <w:spacing w:after="0"/>
+            </w:pPr>
             <w:r>
               <w:rPr>
                 <w:rFonts w:ascii="PingFang TC" w:hAnsi="PingFang TC"/>
-                <w:color w:val="2D3748"/>
-                <w:sz w:val="18"/>
+                <w:color w:val="1A1D20"/>
+                <w:sz w:val="17"/>
               </w:rPr>
-              <w:t>富宇大境（A2 區）全體 6 戶區分所有權人（名冊如後附連署簽章表）</w:t>
+              <w:t>富宇大境（A2 區）全體 6 戶區分所有權人（連署簽章冊如第二頁）</w:t>
             </w:r>
           </w:p>
         </w:tc>
@@ -148,23 +152,25 @@
       <w:tr>
         <w:tc>
           <w:tcPr>
-            <w:tcW w:type="dxa" w:w="1814"/>
-            <w:shd w:fill="FFFBEB"/>
+            <w:tcW w:type="dxa" w:w="1587"/>
+            <w:shd w:fill="FFFDF5"/>
             <w:tcMar>
-              <w:top w:w="70" w:type="dxa"/>
-              <w:bottom w:w="70" w:type="dxa"/>
-              <w:left w:w="110" w:type="dxa"/>
-              <w:right w:w="110" w:type="dxa"/>
+              <w:top w:w="45" w:type="dxa"/>
+              <w:bottom w:w="45" w:type="dxa"/>
+              <w:left w:w="80" w:type="dxa"/>
+              <w:right w:w="80" w:type="dxa"/>
             </w:tcMar>
-            <w:shd w:fill="FAF8F2"/>
           </w:tcPr>
           <w:p>
+            <w:pPr>
+              <w:spacing w:after="0"/>
+            </w:pPr>
             <w:r>
               <w:rPr>
                 <w:rFonts w:ascii="PingFang TC" w:hAnsi="PingFang TC"/>
                 <w:b/>
-                <w:color w:val="A83212"/>
-                <w:sz w:val="18"/>
+                <w:color w:val="B8860B"/>
+                <w:sz w:val="17"/>
               </w:rPr>
               <w:t>法 令 依 據</w:t>
             </w:r>
@@ -172,24 +178,26 @@
         </w:tc>
         <w:tc>
           <w:tcPr>
-            <w:tcW w:type="dxa" w:w="7824"/>
+            <w:tcW w:type="dxa" w:w="8277"/>
             <w:shd w:fill="FFFFFF"/>
             <w:tcMar>
-              <w:top w:w="70" w:type="dxa"/>
-              <w:bottom w:w="70" w:type="dxa"/>
-              <w:left w:w="110" w:type="dxa"/>
-              <w:right w:w="110" w:type="dxa"/>
+              <w:top w:w="45" w:type="dxa"/>
+              <w:bottom w:w="45" w:type="dxa"/>
+              <w:left w:w="80" w:type="dxa"/>
+              <w:right w:w="80" w:type="dxa"/>
             </w:tcMar>
-            <w:shd w:fill="FAF8F2"/>
           </w:tcPr>
           <w:p>
+            <w:pPr>
+              <w:spacing w:after="0"/>
+            </w:pPr>
             <w:r>
               <w:rPr>
                 <w:rFonts w:ascii="PingFang TC" w:hAnsi="PingFang TC"/>
-                <w:color w:val="2D3748"/>
-                <w:sz w:val="18"/>
+                <w:color w:val="1A1D20"/>
+                <w:sz w:val="17"/>
               </w:rPr>
-              <w:t>《公寓大廈管理條例》第 26 條第 1 項（得獨立使用分別成立管委會）</w:t>
+              <w:t>《公寓大廈管理條例》第 26 條第 1 項（得各自獨立使用分別成立管理委員會）</w:t>
             </w:r>
           </w:p>
         </w:tc>
@@ -197,54 +205,63 @@
       <w:tr>
         <w:tc>
           <w:tcPr>
-            <w:tcW w:type="dxa" w:w="1814"/>
-            <w:shd w:fill="FFFBEB"/>
+            <w:tcW w:type="dxa" w:w="1587"/>
+            <w:shd w:fill="FFFDF5"/>
             <w:tcMar>
-              <w:top w:w="70" w:type="dxa"/>
-              <w:bottom w:w="70" w:type="dxa"/>
-              <w:left w:w="110" w:type="dxa"/>
-              <w:right w:w="110" w:type="dxa"/>
+              <w:top w:w="45" w:type="dxa"/>
+              <w:bottom w:w="45" w:type="dxa"/>
+              <w:left w:w="80" w:type="dxa"/>
+              <w:right w:w="80" w:type="dxa"/>
             </w:tcMar>
-            <w:shd w:fill="FFFDF5"/>
           </w:tcPr>
           <w:p>
+            <w:pPr>
+              <w:spacing w:after="0"/>
+            </w:pPr>
             <w:r>
               <w:rPr>
                 <w:rFonts w:ascii="PingFang TC" w:hAnsi="PingFang TC"/>
                 <w:b/>
-                <w:color w:val="A83212"/>
-                <w:sz w:val="18"/>
+                <w:color w:val="B8860B"/>
+                <w:sz w:val="17"/>
               </w:rPr>
-              <w:t>受 託 召 集 人</w:t>
+              <w:t>受託召集人</w:t>
             </w:r>
           </w:p>
         </w:tc>
         <w:tc>
           <w:tcPr>
-            <w:tcW w:type="dxa" w:w="7824"/>
-            <w:shd w:fill="F8FAFC"/>
+            <w:tcW w:type="dxa" w:w="8277"/>
+            <w:shd w:fill="FAF8F2"/>
             <w:tcMar>
-              <w:top w:w="70" w:type="dxa"/>
-              <w:bottom w:w="70" w:type="dxa"/>
-              <w:left w:w="110" w:type="dxa"/>
-              <w:right w:w="110" w:type="dxa"/>
+              <w:top w:w="45" w:type="dxa"/>
+              <w:bottom w:w="45" w:type="dxa"/>
+              <w:left w:w="80" w:type="dxa"/>
+              <w:right w:w="80" w:type="dxa"/>
             </w:tcMar>
-            <w:shd w:fill="FFFDF5"/>
           </w:tcPr>
           <w:p>
+            <w:pPr>
+              <w:spacing w:after="0"/>
+            </w:pPr>
             <w:r>
               <w:rPr>
                 <w:rFonts w:ascii="PingFang TC" w:hAnsi="PingFang TC"/>
-                <w:color w:val="2D3748"/>
-                <w:sz w:val="18"/>
+                <w:b/>
+                <w:color w:val="1A1D20"/>
+                <w:sz w:val="17"/>
               </w:rPr>
-              <w:t>廖倫豪 先生（由全體 6 戶推派代表受託全權對外接洽、協商與簽收公文）</w:t>
+              <w:t>廖倫豪 先生（全權代表本區 6 戶對外接洽、協商與簽收公文）</w:t>
             </w:r>
           </w:p>
         </w:tc>
       </w:tr>
     </w:tbl>
-    <w:p/>
+    <w:p>
+      <w:pPr>
+        <w:spacing w:before="40" w:after="40"/>
+      </w:pPr>
+    </w:p>
     <w:tbl>
       <w:tblPr>
         <w:tblW w:type="auto" w:w="0"/>
@@ -252,47 +269,44 @@
         <w:tblLook w:firstColumn="1" w:firstRow="1" w:lastColumn="0" w:lastRow="0" w:noHBand="0" w:noVBand="1" w:val="04A0"/>
       </w:tblPr>
       <w:tblGrid>
-        <w:gridCol w:w="9638"/>
+        <w:gridCol w:w="9866"/>
       </w:tblGrid>
       <w:tr>
         <w:tc>
           <w:tcPr>
-            <w:tcW w:type="dxa" w:w="9638"/>
-            <w:shd w:fill="FFFBEB"/>
+            <w:tcW w:type="dxa" w:w="9865"/>
+            <w:shd w:fill="FFFDF5"/>
             <w:tcMar>
-              <w:top w:w="120" w:type="dxa"/>
-              <w:bottom w:w="120" w:type="dxa"/>
-              <w:left w:w="180" w:type="dxa"/>
-              <w:right w:w="160" w:type="dxa"/>
+              <w:top w:w="70" w:type="dxa"/>
+              <w:bottom w:w="70" w:type="dxa"/>
+              <w:left w:w="120" w:type="dxa"/>
+              <w:right w:w="100" w:type="dxa"/>
             </w:tcMar>
             <w:tcBorders>
-              <w:left w:val="single" w:sz="28" w:space="0" w:color="DE5814"/>
+              <w:left w:val="single" w:sz="24" w:space="0" w:color="D4AF37"/>
               <w:top w:val="none"/>
               <w:right w:val="none"/>
               <w:bottom w:val="none"/>
             </w:tcBorders>
-            <w:shd w:fill="1A1D20"/>
           </w:tcPr>
           <w:p>
             <w:pPr>
-              <w:spacing w:line="312" w:lineRule="auto"/>
+              <w:spacing w:line="288" w:lineRule="auto" w:after="0"/>
             </w:pPr>
             <w:r>
               <w:rPr>
                 <w:rFonts w:ascii="PingFang TC" w:hAnsi="PingFang TC"/>
                 <w:b/>
-                <w:color w:val="D4AF37"/>
-                <w:sz w:val="21"/>
+                <w:color w:val="B8860B"/>
+                <w:sz w:val="19"/>
               </w:rPr>
               <w:t>【主旨】</w:t>
-              <w:br/>
             </w:r>
             <w:r>
               <w:rPr>
                 <w:rFonts w:ascii="PingFang TC" w:hAnsi="PingFang TC"/>
-                <w:b/>
-                <w:color w:val="D4AF37"/>
-                <w:sz w:val="19"/>
+                <w:color w:val="1A1D20"/>
+                <w:sz w:val="17"/>
               </w:rPr>
               <w:t>為落實權責相符與居住自治原則，富宇大境（A2 區）全體 6 戶區分所有權人謹依《公寓大廈管理條例》第 26 條第 1 項規定，正式提請審議本區「依法自富宇大地社區管理委員會獨立分割、成立富宇大境管理委員會及辦理專案資產移交清算案」，並請列入管理委員會例行會議審議與辦理專案資產移交清算，請 查照。</w:t>
             </w:r>
@@ -300,185 +314,162 @@
         </w:tc>
       </w:tr>
     </w:tbl>
-    <w:p/>
     <w:p>
       <w:pPr>
-        <w:spacing w:before="120" w:after="80"/>
+        <w:spacing w:before="80" w:after="40"/>
       </w:pPr>
       <w:r>
         <w:rPr>
           <w:rFonts w:ascii="PingFang TC" w:hAnsi="PingFang TC"/>
           <w:b/>
           <w:color w:val="B8860B"/>
-          <w:sz w:val="22"/>
+          <w:sz w:val="19"/>
         </w:rPr>
         <w:t>【說明】</w:t>
       </w:r>
     </w:p>
     <w:p>
       <w:pPr>
-        <w:spacing w:line="312" w:lineRule="auto" w:before="40" w:after="80"/>
+        <w:spacing w:line="276" w:lineRule="auto" w:before="20" w:after="40"/>
+      </w:pPr>
+      <w:r>
+        <w:rPr>
+          <w:rFonts w:ascii="PingFang TC" w:hAnsi="PingFang TC"/>
+          <w:b/>
+          <w:color w:val="B8860B"/>
+          <w:sz w:val="17"/>
+        </w:rPr>
+        <w:t>一、法定獨立要件充分且明確：</w:t>
+      </w:r>
+      <w:r>
+        <w:rPr>
+          <w:rFonts w:ascii="PingFang TC" w:hAnsi="PingFang TC"/>
+          <w:color w:val="1A1D20"/>
+          <w:sz w:val="17"/>
+        </w:rPr>
+        <w:t>按《公寓大廈管理條例》第 26 條第 1 項明定，多數各自獨立使用之建築物，如各該區得獨立使用且能分別成立管理委員會者，得分別成立管理委員會。本區（A2 大境共 6 戶透天別墅，門牌為台中市沙鹿區龍社路 593、595、597、599、601、603 號）之基地臨接公有計畫道路龍社路，出入交通完全獨立，絕不途經富宇大地內部私設巷道（如 642 巷等），符合得各自獨立使用之法定要件。</w:t>
+      </w:r>
+    </w:p>
+    <w:p>
+      <w:pPr>
+        <w:spacing w:line="276" w:lineRule="auto" w:before="20" w:after="40"/>
+      </w:pPr>
+      <w:r>
+        <w:rPr>
+          <w:rFonts w:ascii="PingFang TC" w:hAnsi="PingFang TC"/>
+          <w:b/>
+          <w:color w:val="B8860B"/>
+          <w:sz w:val="17"/>
+        </w:rPr>
+        <w:t>二、生活機能自理，水電機電排污完全獨立：</w:t>
+      </w:r>
+      <w:r>
+        <w:rPr>
+          <w:rFonts w:ascii="PingFang TC" w:hAnsi="PingFang TC"/>
+          <w:color w:val="1A1D20"/>
+          <w:sz w:val="17"/>
+        </w:rPr>
+        <w:t>本區 6 戶透天生活廢棄物，現今均由住戶於門前直接等候台中市環保局公有垃圾車定時清運（完全免費）；本區自願放棄使用內部收費子母車及環保室；且自來水、自用電表與排污系統均由公用幹管直供或獨立自理，完全無接入或依賴富宇大地大社區內部私設之加壓受水池、抽水馬達或排污中繼設備，無任何機電牽絆。</w:t>
+      </w:r>
+    </w:p>
+    <w:p>
+      <w:pPr>
+        <w:spacing w:line="276" w:lineRule="auto" w:before="20" w:after="40"/>
+      </w:pPr>
+      <w:r>
+        <w:rPr>
+          <w:rFonts w:ascii="PingFang TC" w:hAnsi="PingFang TC"/>
+          <w:b/>
+          <w:color w:val="B8860B"/>
+          <w:sz w:val="17"/>
+        </w:rPr>
+        <w:t>三、專款定存單獨立立卷，產權清晰：</w:t>
+      </w:r>
+      <w:r>
+        <w:rPr>
+          <w:rFonts w:ascii="PingFang TC" w:hAnsi="PingFang TC"/>
+          <w:color w:val="1A1D20"/>
+          <w:sz w:val="17"/>
+        </w:rPr>
+        <w:t>查富宇大地管委會於 115 年 5 月例會決議及 9 月例會財務報告載明，台中市政府核退之公共基金中，「A2 大境區定存單」金額為新台幣 220,231 元整，本屬專款專案保管；連同起造人富宇建設移交之交屋管理基金（每戶 1 萬元，大境 6 戶共 60,000 元整），資產邊界涇渭分明，分割作業完全不影響富宇大地其餘 235 戶原有逾 760 萬元之公共基金與營運大盤。</w:t>
+      </w:r>
+    </w:p>
+    <w:p>
+      <w:pPr>
+        <w:spacing w:before="80" w:after="40"/>
+      </w:pPr>
+      <w:r>
+        <w:rPr>
+          <w:rFonts w:ascii="PingFang TC" w:hAnsi="PingFang TC"/>
+          <w:b/>
+          <w:color w:val="B8860B"/>
+          <w:sz w:val="19"/>
+        </w:rPr>
+        <w:t>【辦法】</w:t>
+      </w:r>
+    </w:p>
+    <w:p>
+      <w:pPr>
+        <w:spacing w:line="276" w:lineRule="auto" w:before="20" w:after="40"/>
       </w:pPr>
       <w:r>
         <w:rPr>
           <w:rFonts w:ascii="PingFang TC" w:hAnsi="PingFang TC"/>
           <w:b/>
           <w:color w:val="D4AF37"/>
-          <w:sz w:val="19"/>
+          <w:sz w:val="17"/>
         </w:rPr>
-        <w:t>一、法定獨立要件充分且明確：</w:t>
+        <w:t>一、提案審議作業：</w:t>
       </w:r>
       <w:r>
         <w:rPr>
           <w:rFonts w:ascii="PingFang TC" w:hAnsi="PingFang TC"/>
-          <w:color w:val="2D3748"/>
-          <w:sz w:val="18"/>
+          <w:color w:val="1A1D20"/>
+          <w:sz w:val="17"/>
         </w:rPr>
-        <w:t>按《公寓大廈管理條例》第 26 條第 1 項明定，多數各自獨立使用之建築物，如各該區得獨立使用且能分別成立管理委員會者，得分別成立管理委員會。本區（A2 大境共 6 戶透天別墅，門牌為台中市沙鹿區龍社路 593、595、597、599、601、603 號）之基地臨接公有計畫道路龍社路，出入交通完全獨立，絕不途經富宇大地內部私設巷道（如 642 巷等），符合得各自獨立使用之法定要件。</w:t>
+        <w:t>請富宇大地社區管理委員會於收受本申請書後，依權責列入最近一次管委會例行會議審議，確認本案法定獨立分割與辦理專案資產清算移交。</w:t>
       </w:r>
     </w:p>
     <w:p>
       <w:pPr>
-        <w:spacing w:line="312" w:lineRule="auto" w:before="40" w:after="80"/>
+        <w:spacing w:line="276" w:lineRule="auto" w:before="20" w:after="40"/>
       </w:pPr>
       <w:r>
         <w:rPr>
           <w:rFonts w:ascii="PingFang TC" w:hAnsi="PingFang TC"/>
           <w:b/>
           <w:color w:val="D4AF37"/>
-          <w:sz w:val="19"/>
+          <w:sz w:val="17"/>
         </w:rPr>
-        <w:t>二、生活機能自理，無公設依賴性：</w:t>
+        <w:t>二、資產移交與管理費提存準備：</w:t>
       </w:r>
       <w:r>
         <w:rPr>
           <w:rFonts w:ascii="PingFang TC" w:hAnsi="PingFang TC"/>
-          <w:color w:val="2D3748"/>
-          <w:sz w:val="18"/>
+          <w:color w:val="1A1D20"/>
+          <w:sz w:val="17"/>
         </w:rPr>
-        <w:t>本區 6 戶透天生活廢棄物，現今均由住戶於門前直接等候台中市環保局公有垃圾車定時清運（完全免費）；本區住戶未曾使用、未來亦完全自願放棄使用富宇大地社區內部之收費垃圾子母車及環保室，亦未使用貨櫃屋管理室等公設，在物理上與管理上均無任何「不可分之共用設施」，無公設牽絆阻礙。</w:t>
+        <w:t>建請財務委員會先期核算 A2 大境定存單（NT$ 220,231 元加計孳息）與交屋基金（NT$ 60,000 元）之分割協議書草案。自本申請書合法送達之日起至資產清算協議生效之過渡期間，A2 大境 6 戶管理費統一由受託召集人代收提存於大境專戶共管，俟完成清算後依實質公電攤提結算，以杜爭議。</w:t>
       </w:r>
     </w:p>
     <w:p>
       <w:pPr>
-        <w:spacing w:line="312" w:lineRule="auto" w:before="40" w:after="80"/>
+        <w:spacing w:line="276" w:lineRule="auto" w:before="20" w:after="40"/>
       </w:pPr>
       <w:r>
         <w:rPr>
           <w:rFonts w:ascii="PingFang TC" w:hAnsi="PingFang TC"/>
           <w:b/>
           <w:color w:val="D4AF37"/>
-          <w:sz w:val="19"/>
-        </w:rPr>
-        <w:t>三、專款定存單獨立立卷，產權清晰：</w:t>
-      </w:r>
-      <w:r>
-        <w:rPr>
-          <w:rFonts w:ascii="PingFang TC" w:hAnsi="PingFang TC"/>
-          <w:color w:val="2D3748"/>
-          <w:sz w:val="18"/>
-        </w:rPr>
-        <w:t>查富宇大地管委會於 115 年 5 月例會決議及 9 月例會財務報告載明，台中市政府核退之公共基金中，「A2 大境區定存單」金額為新台幣 220,231 元整，本屬專款專案保管；連同起造人富宇建設於 115 年 5 月 5 日移交之交屋管理基金（每戶 1 萬元，大境 6 戶共 60,000 元整），資產邊界涇渭分明，分割作業完全不影響富宇大地其餘 235 戶原有逾 760 萬元之公共基金與營運大盤。</w:t>
-      </w:r>
-    </w:p>
-    <w:p>
-      <w:pPr>
-        <w:spacing w:line="312" w:lineRule="auto" w:before="40" w:after="80"/>
-      </w:pPr>
-      <w:r>
-        <w:rPr>
-          <w:rFonts w:ascii="PingFang TC" w:hAnsi="PingFang TC"/>
-          <w:b/>
-          <w:color w:val="DE5814"/>
-          <w:sz w:val="19"/>
-        </w:rPr>
-        <w:t>四、雙贏互利之治理格局：</w:t>
-      </w:r>
-      <w:r>
-        <w:rPr>
-          <w:rFonts w:ascii="PingFang TC" w:hAnsi="PingFang TC"/>
-          <w:color w:val="2D3748"/>
-          <w:sz w:val="18"/>
-        </w:rPr>
-        <w:t>大境獨立後，大社區內部 6 桶子母車由 235 戶使用，垃圾容量更充裕、異味更少；且物業經理曹鈺芳無需再跨越龍社路巡查大境，可專注服務內部聚落，對兩造社區營運維護均有實質助益。</w:t>
-      </w:r>
-    </w:p>
-    <w:p>
-      <w:pPr>
-        <w:spacing w:before="160" w:after="80"/>
-      </w:pPr>
-      <w:r>
-        <w:rPr>
-          <w:rFonts w:ascii="PingFang TC" w:hAnsi="PingFang TC"/>
-          <w:b/>
-          <w:color w:val="B8860B"/>
-          <w:sz w:val="22"/>
-        </w:rPr>
-        <w:t>【辦法】</w:t>
-      </w:r>
-    </w:p>
-    <w:p>
-      <w:pPr>
-        <w:spacing w:line="312" w:lineRule="auto" w:before="40" w:after="80"/>
-      </w:pPr>
-      <w:r>
-        <w:rPr>
-          <w:rFonts w:ascii="PingFang TC" w:hAnsi="PingFang TC"/>
-          <w:b/>
-          <w:color w:val="D4AF37"/>
-          <w:sz w:val="19"/>
-        </w:rPr>
-        <w:t>一、提案審議排案：</w:t>
-      </w:r>
-      <w:r>
-        <w:rPr>
-          <w:rFonts w:ascii="PingFang TC" w:hAnsi="PingFang TC"/>
-          <w:color w:val="2D3748"/>
-          <w:sz w:val="18"/>
-        </w:rPr>
-        <w:t>請富宇大地社區管理委員會於收受本申請書後，依權責列入最近一次管委會例行會議審議，確認本案法定獨立分割與辦理專案資產清算移交。</w:t>
-      </w:r>
-    </w:p>
-    <w:p>
-      <w:pPr>
-        <w:spacing w:line="312" w:lineRule="auto" w:before="40" w:after="80"/>
-      </w:pPr>
-      <w:r>
-        <w:rPr>
-          <w:rFonts w:ascii="PingFang TC" w:hAnsi="PingFang TC"/>
-          <w:b/>
-          <w:color w:val="D4AF37"/>
-          <w:sz w:val="19"/>
-        </w:rPr>
-        <w:t>二、資產移交準備：</w:t>
-      </w:r>
-      <w:r>
-        <w:rPr>
-          <w:rFonts w:ascii="PingFang TC" w:hAnsi="PingFang TC"/>
-          <w:color w:val="2D3748"/>
-          <w:sz w:val="18"/>
-        </w:rPr>
-        <w:t>建請財務委員會先期核算 A2 大境定存單（NT$ 220,231 元加計孳息）與交屋基金（NT$ 60,000 元）之分割清算協議書草案。</w:t>
-      </w:r>
-    </w:p>
-    <w:p>
-      <w:pPr>
-        <w:spacing w:line="312" w:lineRule="auto" w:before="40" w:after="80"/>
-      </w:pPr>
-      <w:r>
-        <w:rPr>
-          <w:rFonts w:ascii="PingFang TC" w:hAnsi="PingFang TC"/>
-          <w:b/>
-          <w:color w:val="D4AF37"/>
-          <w:sz w:val="19"/>
+          <w:sz w:val="17"/>
         </w:rPr>
         <w:t>三、報備變更協力：</w:t>
       </w:r>
       <w:r>
         <w:rPr>
           <w:rFonts w:ascii="PingFang TC" w:hAnsi="PingFang TC"/>
-          <w:color w:val="2D3748"/>
-          <w:sz w:val="18"/>
+          <w:color w:val="1A1D20"/>
+          <w:sz w:val="17"/>
         </w:rPr>
         <w:t>雙方備齊法定申請公文與修訂後規約，共同向主管機關（台中市龍井區公所）辦理報備戶數變更與富宇大境獨立管委會成立備查。</w:t>
       </w:r>
@@ -490,27 +481,28 @@
     </w:p>
     <w:p>
       <w:pPr>
-        <w:spacing w:before="200" w:after="80"/>
+        <w:spacing w:before="80" w:after="40"/>
+        <w:jc w:val="center"/>
       </w:pPr>
       <w:r>
         <w:rPr>
           <w:rFonts w:ascii="PingFang TC" w:hAnsi="PingFang TC"/>
           <w:b/>
-          <w:color w:val="A83212"/>
-          <w:sz w:val="28"/>
+          <w:color w:val="B8860B"/>
+          <w:sz w:val="26"/>
         </w:rPr>
         <w:t>富宇大境（A2 區）全體 6 戶區分所有權人連署立案簽章冊</w:t>
       </w:r>
     </w:p>
     <w:p>
       <w:pPr>
-        <w:spacing w:before="40" w:after="240"/>
+        <w:spacing w:before="0" w:after="160"/>
       </w:pPr>
       <w:r>
         <w:rPr>
           <w:rFonts w:ascii="PingFang TC" w:hAnsi="PingFang TC"/>
-          <w:color w:val="2D3748"/>
-          <w:sz w:val="19"/>
+          <w:color w:val="1A1D20"/>
+          <w:sz w:val="17"/>
         </w:rPr>
         <w:t>立連署同意書人確認已審閱上述申請書內容及所附可行性研究報告，特此親筆簽署並蓋章，確認百分之百全數同意本區獨立分割案，並授權召集人辦理全般公務程序：</w:t>
       </w:r>
@@ -522,33 +514,35 @@
         <w:tblLook w:firstColumn="1" w:firstRow="1" w:lastColumn="0" w:lastRow="0" w:noHBand="0" w:noVBand="1" w:val="04A0"/>
       </w:tblPr>
       <w:tblGrid>
-        <w:gridCol w:w="1606"/>
-        <w:gridCol w:w="1606"/>
-        <w:gridCol w:w="1606"/>
-        <w:gridCol w:w="1606"/>
-        <w:gridCol w:w="1606"/>
-        <w:gridCol w:w="1606"/>
+        <w:gridCol w:w="1644"/>
+        <w:gridCol w:w="1644"/>
+        <w:gridCol w:w="1644"/>
+        <w:gridCol w:w="1644"/>
+        <w:gridCol w:w="1644"/>
+        <w:gridCol w:w="1644"/>
       </w:tblGrid>
       <w:tr>
         <w:tc>
           <w:tcPr>
             <w:tcW w:type="dxa" w:w="1701"/>
-            <w:shd w:fill="2D3748"/>
+            <w:shd w:fill="1A1D20"/>
             <w:tcMar>
-              <w:top w:w="100" w:type="dxa"/>
-              <w:bottom w:w="100" w:type="dxa"/>
-              <w:left w:w="80" w:type="dxa"/>
-              <w:right w:w="80" w:type="dxa"/>
+              <w:top w:w="70" w:type="dxa"/>
+              <w:bottom w:w="70" w:type="dxa"/>
+              <w:left w:w="60" w:type="dxa"/>
+              <w:right w:w="60" w:type="dxa"/>
             </w:tcMar>
-            <w:shd w:fill="1A1D20"/>
           </w:tcPr>
           <w:p>
+            <w:pPr>
+              <w:spacing w:after="0"/>
+            </w:pPr>
             <w:r>
               <w:rPr>
                 <w:rFonts w:ascii="PingFang TC" w:hAnsi="PingFang TC"/>
                 <w:b/>
                 <w:color w:val="D4AF37"/>
-                <w:sz w:val="18"/>
+                <w:sz w:val="17"/>
               </w:rPr>
               <w:t>戶號門牌</w:t>
             </w:r>
@@ -557,22 +551,24 @@
         <w:tc>
           <w:tcPr>
             <w:tcW w:type="dxa" w:w="1474"/>
-            <w:shd w:fill="2D3748"/>
+            <w:shd w:fill="1A1D20"/>
             <w:tcMar>
-              <w:top w:w="100" w:type="dxa"/>
-              <w:bottom w:w="100" w:type="dxa"/>
-              <w:left w:w="80" w:type="dxa"/>
-              <w:right w:w="80" w:type="dxa"/>
+              <w:top w:w="70" w:type="dxa"/>
+              <w:bottom w:w="70" w:type="dxa"/>
+              <w:left w:w="60" w:type="dxa"/>
+              <w:right w:w="60" w:type="dxa"/>
             </w:tcMar>
-            <w:shd w:fill="1A1D20"/>
           </w:tcPr>
           <w:p>
+            <w:pPr>
+              <w:spacing w:after="0"/>
+            </w:pPr>
             <w:r>
               <w:rPr>
                 <w:rFonts w:ascii="PingFang TC" w:hAnsi="PingFang TC"/>
                 <w:b/>
                 <w:color w:val="D4AF37"/>
-                <w:sz w:val="18"/>
+                <w:sz w:val="17"/>
               </w:rPr>
               <w:t>區權人姓名</w:t>
             </w:r>
@@ -581,22 +577,24 @@
         <w:tc>
           <w:tcPr>
             <w:tcW w:type="dxa" w:w="1587"/>
-            <w:shd w:fill="2D3748"/>
+            <w:shd w:fill="1A1D20"/>
             <w:tcMar>
-              <w:top w:w="100" w:type="dxa"/>
-              <w:bottom w:w="100" w:type="dxa"/>
-              <w:left w:w="80" w:type="dxa"/>
-              <w:right w:w="80" w:type="dxa"/>
+              <w:top w:w="70" w:type="dxa"/>
+              <w:bottom w:w="70" w:type="dxa"/>
+              <w:left w:w="60" w:type="dxa"/>
+              <w:right w:w="60" w:type="dxa"/>
             </w:tcMar>
-            <w:shd w:fill="1A1D20"/>
           </w:tcPr>
           <w:p>
+            <w:pPr>
+              <w:spacing w:after="0"/>
+            </w:pPr>
             <w:r>
               <w:rPr>
                 <w:rFonts w:ascii="PingFang TC" w:hAnsi="PingFang TC"/>
                 <w:b/>
                 <w:color w:val="D4AF37"/>
-                <w:sz w:val="18"/>
+                <w:sz w:val="17"/>
               </w:rPr>
               <w:t>身分證字號</w:t>
             </w:r>
@@ -605,22 +603,24 @@
         <w:tc>
           <w:tcPr>
             <w:tcW w:type="dxa" w:w="1587"/>
-            <w:shd w:fill="2D3748"/>
+            <w:shd w:fill="1A1D20"/>
             <w:tcMar>
-              <w:top w:w="100" w:type="dxa"/>
-              <w:bottom w:w="100" w:type="dxa"/>
-              <w:left w:w="80" w:type="dxa"/>
-              <w:right w:w="80" w:type="dxa"/>
+              <w:top w:w="70" w:type="dxa"/>
+              <w:bottom w:w="70" w:type="dxa"/>
+              <w:left w:w="60" w:type="dxa"/>
+              <w:right w:w="60" w:type="dxa"/>
             </w:tcMar>
-            <w:shd w:fill="1A1D20"/>
           </w:tcPr>
           <w:p>
+            <w:pPr>
+              <w:spacing w:after="0"/>
+            </w:pPr>
             <w:r>
               <w:rPr>
                 <w:rFonts w:ascii="PingFang TC" w:hAnsi="PingFang TC"/>
                 <w:b/>
                 <w:color w:val="D4AF37"/>
-                <w:sz w:val="18"/>
+                <w:sz w:val="17"/>
               </w:rPr>
               <w:t>聯絡電話</w:t>
             </w:r>
@@ -628,23 +628,25 @@
         </w:tc>
         <w:tc>
           <w:tcPr>
-            <w:tcW w:type="dxa" w:w="1701"/>
-            <w:shd w:fill="2D3748"/>
+            <w:tcW w:type="dxa" w:w="1814"/>
+            <w:shd w:fill="1A1D20"/>
             <w:tcMar>
-              <w:top w:w="100" w:type="dxa"/>
-              <w:bottom w:w="100" w:type="dxa"/>
-              <w:left w:w="80" w:type="dxa"/>
-              <w:right w:w="80" w:type="dxa"/>
+              <w:top w:w="70" w:type="dxa"/>
+              <w:bottom w:w="70" w:type="dxa"/>
+              <w:left w:w="60" w:type="dxa"/>
+              <w:right w:w="60" w:type="dxa"/>
             </w:tcMar>
-            <w:shd w:fill="1A1D20"/>
           </w:tcPr>
           <w:p>
+            <w:pPr>
+              <w:spacing w:after="0"/>
+            </w:pPr>
             <w:r>
               <w:rPr>
                 <w:rFonts w:ascii="PingFang TC" w:hAnsi="PingFang TC"/>
                 <w:b/>
                 <w:color w:val="D4AF37"/>
-                <w:sz w:val="18"/>
+                <w:sz w:val="17"/>
               </w:rPr>
               <w:t>親筆簽名</w:t>
             </w:r>
@@ -652,23 +654,25 @@
         </w:tc>
         <w:tc>
           <w:tcPr>
-            <w:tcW w:type="dxa" w:w="1587"/>
-            <w:shd w:fill="2D3748"/>
+            <w:tcW w:type="dxa" w:w="1701"/>
+            <w:shd w:fill="1A1D20"/>
             <w:tcMar>
-              <w:top w:w="100" w:type="dxa"/>
-              <w:bottom w:w="100" w:type="dxa"/>
-              <w:left w:w="80" w:type="dxa"/>
-              <w:right w:w="80" w:type="dxa"/>
+              <w:top w:w="70" w:type="dxa"/>
+              <w:bottom w:w="70" w:type="dxa"/>
+              <w:left w:w="60" w:type="dxa"/>
+              <w:right w:w="60" w:type="dxa"/>
             </w:tcMar>
-            <w:shd w:fill="1A1D20"/>
           </w:tcPr>
           <w:p>
+            <w:pPr>
+              <w:spacing w:after="0"/>
+            </w:pPr>
             <w:r>
               <w:rPr>
                 <w:rFonts w:ascii="PingFang TC" w:hAnsi="PingFang TC"/>
                 <w:b/>
                 <w:color w:val="D4AF37"/>
-                <w:sz w:val="18"/>
+                <w:sz w:val="17"/>
               </w:rPr>
               <w:t>印鑑蓋章 / 日期</w:t>
             </w:r>
@@ -679,22 +683,24 @@
         <w:tc>
           <w:tcPr>
             <w:tcW w:type="dxa" w:w="1701"/>
-            <w:shd w:fill="FFFBEB"/>
+            <w:shd w:fill="FFFDF5"/>
             <w:tcMar>
-              <w:top w:w="140" w:type="dxa"/>
-              <w:bottom w:w="140" w:type="dxa"/>
-              <w:left w:w="80" w:type="dxa"/>
-              <w:right w:w="80" w:type="dxa"/>
+              <w:top w:w="110" w:type="dxa"/>
+              <w:bottom w:w="110" w:type="dxa"/>
+              <w:left w:w="60" w:type="dxa"/>
+              <w:right w:w="60" w:type="dxa"/>
             </w:tcMar>
-            <w:shd w:fill="FFFDF5"/>
           </w:tcPr>
           <w:p>
+            <w:pPr>
+              <w:spacing w:after="0"/>
+            </w:pPr>
             <w:r>
               <w:rPr>
                 <w:rFonts w:ascii="PingFang TC" w:hAnsi="PingFang TC"/>
                 <w:b/>
-                <w:color w:val="A83212"/>
-                <w:sz w:val="18"/>
+                <w:color w:val="B8860B"/>
+                <w:sz w:val="17"/>
               </w:rPr>
               <w:t>龍社路 593 號</w:t>
             </w:r>
@@ -705,92 +711,109 @@
             <w:tcW w:type="dxa" w:w="1474"/>
             <w:shd w:fill="FFFFFF"/>
             <w:tcMar>
-              <w:top w:w="140" w:type="dxa"/>
-              <w:bottom w:w="140" w:type="dxa"/>
-              <w:left w:w="80" w:type="dxa"/>
-              <w:right w:w="80" w:type="dxa"/>
+              <w:top w:w="110" w:type="dxa"/>
+              <w:bottom w:w="110" w:type="dxa"/>
+              <w:left w:w="60" w:type="dxa"/>
+              <w:right w:w="60" w:type="dxa"/>
             </w:tcMar>
-            <w:shd w:fill="FFFDF5"/>
           </w:tcPr>
-          <w:p/>
+          <w:p>
+            <w:pPr>
+              <w:spacing w:after="0"/>
+            </w:pPr>
+          </w:p>
         </w:tc>
         <w:tc>
           <w:tcPr>
             <w:tcW w:type="dxa" w:w="1587"/>
             <w:shd w:fill="FFFFFF"/>
             <w:tcMar>
-              <w:top w:w="140" w:type="dxa"/>
-              <w:bottom w:w="140" w:type="dxa"/>
-              <w:left w:w="80" w:type="dxa"/>
-              <w:right w:w="80" w:type="dxa"/>
+              <w:top w:w="110" w:type="dxa"/>
+              <w:bottom w:w="110" w:type="dxa"/>
+              <w:left w:w="60" w:type="dxa"/>
+              <w:right w:w="60" w:type="dxa"/>
             </w:tcMar>
-            <w:shd w:fill="FFFDF5"/>
           </w:tcPr>
-          <w:p/>
+          <w:p>
+            <w:pPr>
+              <w:spacing w:after="0"/>
+            </w:pPr>
+          </w:p>
         </w:tc>
         <w:tc>
           <w:tcPr>
             <w:tcW w:type="dxa" w:w="1587"/>
             <w:shd w:fill="FFFFFF"/>
             <w:tcMar>
-              <w:top w:w="140" w:type="dxa"/>
-              <w:bottom w:w="140" w:type="dxa"/>
-              <w:left w:w="80" w:type="dxa"/>
-              <w:right w:w="80" w:type="dxa"/>
+              <w:top w:w="110" w:type="dxa"/>
+              <w:bottom w:w="110" w:type="dxa"/>
+              <w:left w:w="60" w:type="dxa"/>
+              <w:right w:w="60" w:type="dxa"/>
             </w:tcMar>
-            <w:shd w:fill="FFFDF5"/>
           </w:tcPr>
-          <w:p/>
+          <w:p>
+            <w:pPr>
+              <w:spacing w:after="0"/>
+            </w:pPr>
+          </w:p>
+        </w:tc>
+        <w:tc>
+          <w:tcPr>
+            <w:tcW w:type="dxa" w:w="1814"/>
+            <w:shd w:fill="FFFFFF"/>
+            <w:tcMar>
+              <w:top w:w="110" w:type="dxa"/>
+              <w:bottom w:w="110" w:type="dxa"/>
+              <w:left w:w="60" w:type="dxa"/>
+              <w:right w:w="60" w:type="dxa"/>
+            </w:tcMar>
+          </w:tcPr>
+          <w:p>
+            <w:pPr>
+              <w:spacing w:after="0"/>
+            </w:pPr>
+          </w:p>
         </w:tc>
         <w:tc>
           <w:tcPr>
             <w:tcW w:type="dxa" w:w="1701"/>
             <w:shd w:fill="FFFFFF"/>
             <w:tcMar>
-              <w:top w:w="140" w:type="dxa"/>
-              <w:bottom w:w="140" w:type="dxa"/>
-              <w:left w:w="80" w:type="dxa"/>
-              <w:right w:w="80" w:type="dxa"/>
+              <w:top w:w="110" w:type="dxa"/>
+              <w:bottom w:w="110" w:type="dxa"/>
+              <w:left w:w="60" w:type="dxa"/>
+              <w:right w:w="60" w:type="dxa"/>
             </w:tcMar>
-            <w:shd w:fill="FFFDF5"/>
           </w:tcPr>
-          <w:p/>
-        </w:tc>
-        <w:tc>
-          <w:tcPr>
-            <w:tcW w:type="dxa" w:w="1587"/>
-            <w:shd w:fill="FFFFFF"/>
-            <w:tcMar>
-              <w:top w:w="140" w:type="dxa"/>
-              <w:bottom w:w="140" w:type="dxa"/>
-              <w:left w:w="80" w:type="dxa"/>
-              <w:right w:w="80" w:type="dxa"/>
-            </w:tcMar>
-            <w:shd w:fill="FFFDF5"/>
-          </w:tcPr>
-          <w:p/>
+          <w:p>
+            <w:pPr>
+              <w:spacing w:after="0"/>
+            </w:pPr>
+          </w:p>
         </w:tc>
       </w:tr>
       <w:tr>
         <w:tc>
           <w:tcPr>
             <w:tcW w:type="dxa" w:w="1701"/>
-            <w:shd w:fill="FFFBEB"/>
+            <w:shd w:fill="FFFDF5"/>
             <w:tcMar>
-              <w:top w:w="140" w:type="dxa"/>
-              <w:bottom w:w="140" w:type="dxa"/>
-              <w:left w:w="80" w:type="dxa"/>
-              <w:right w:w="80" w:type="dxa"/>
+              <w:top w:w="110" w:type="dxa"/>
+              <w:bottom w:w="110" w:type="dxa"/>
+              <w:left w:w="60" w:type="dxa"/>
+              <w:right w:w="60" w:type="dxa"/>
             </w:tcMar>
-            <w:shd w:fill="FAF8F2"/>
           </w:tcPr>
           <w:p>
+            <w:pPr>
+              <w:spacing w:after="0"/>
+            </w:pPr>
             <w:r>
               <w:rPr>
                 <w:rFonts w:ascii="PingFang TC" w:hAnsi="PingFang TC"/>
                 <w:b/>
-                <w:color w:val="A83212"/>
-                <w:sz w:val="18"/>
+                <w:color w:val="B8860B"/>
+                <w:sz w:val="17"/>
               </w:rPr>
               <w:t>龍社路 595 號</w:t>
             </w:r>
@@ -799,94 +822,111 @@
         <w:tc>
           <w:tcPr>
             <w:tcW w:type="dxa" w:w="1474"/>
-            <w:shd w:fill="F8FAFC"/>
+            <w:shd w:fill="FAF8F2"/>
             <w:tcMar>
-              <w:top w:w="140" w:type="dxa"/>
-              <w:bottom w:w="140" w:type="dxa"/>
-              <w:left w:w="80" w:type="dxa"/>
-              <w:right w:w="80" w:type="dxa"/>
+              <w:top w:w="110" w:type="dxa"/>
+              <w:bottom w:w="110" w:type="dxa"/>
+              <w:left w:w="60" w:type="dxa"/>
+              <w:right w:w="60" w:type="dxa"/>
             </w:tcMar>
-            <w:shd w:fill="FAF8F2"/>
           </w:tcPr>
-          <w:p/>
+          <w:p>
+            <w:pPr>
+              <w:spacing w:after="0"/>
+            </w:pPr>
+          </w:p>
         </w:tc>
         <w:tc>
           <w:tcPr>
             <w:tcW w:type="dxa" w:w="1587"/>
-            <w:shd w:fill="F8FAFC"/>
+            <w:shd w:fill="FAF8F2"/>
             <w:tcMar>
-              <w:top w:w="140" w:type="dxa"/>
-              <w:bottom w:w="140" w:type="dxa"/>
-              <w:left w:w="80" w:type="dxa"/>
-              <w:right w:w="80" w:type="dxa"/>
+              <w:top w:w="110" w:type="dxa"/>
+              <w:bottom w:w="110" w:type="dxa"/>
+              <w:left w:w="60" w:type="dxa"/>
+              <w:right w:w="60" w:type="dxa"/>
             </w:tcMar>
-            <w:shd w:fill="FAF8F2"/>
           </w:tcPr>
-          <w:p/>
+          <w:p>
+            <w:pPr>
+              <w:spacing w:after="0"/>
+            </w:pPr>
+          </w:p>
         </w:tc>
         <w:tc>
           <w:tcPr>
             <w:tcW w:type="dxa" w:w="1587"/>
-            <w:shd w:fill="F8FAFC"/>
+            <w:shd w:fill="FAF8F2"/>
             <w:tcMar>
-              <w:top w:w="140" w:type="dxa"/>
-              <w:bottom w:w="140" w:type="dxa"/>
-              <w:left w:w="80" w:type="dxa"/>
-              <w:right w:w="80" w:type="dxa"/>
+              <w:top w:w="110" w:type="dxa"/>
+              <w:bottom w:w="110" w:type="dxa"/>
+              <w:left w:w="60" w:type="dxa"/>
+              <w:right w:w="60" w:type="dxa"/>
             </w:tcMar>
+          </w:tcPr>
+          <w:p>
+            <w:pPr>
+              <w:spacing w:after="0"/>
+            </w:pPr>
+          </w:p>
+        </w:tc>
+        <w:tc>
+          <w:tcPr>
+            <w:tcW w:type="dxa" w:w="1814"/>
             <w:shd w:fill="FAF8F2"/>
+            <w:tcMar>
+              <w:top w:w="110" w:type="dxa"/>
+              <w:bottom w:w="110" w:type="dxa"/>
+              <w:left w:w="60" w:type="dxa"/>
+              <w:right w:w="60" w:type="dxa"/>
+            </w:tcMar>
           </w:tcPr>
-          <w:p/>
+          <w:p>
+            <w:pPr>
+              <w:spacing w:after="0"/>
+            </w:pPr>
+          </w:p>
         </w:tc>
         <w:tc>
           <w:tcPr>
             <w:tcW w:type="dxa" w:w="1701"/>
-            <w:shd w:fill="F8FAFC"/>
+            <w:shd w:fill="FAF8F2"/>
             <w:tcMar>
-              <w:top w:w="140" w:type="dxa"/>
-              <w:bottom w:w="140" w:type="dxa"/>
-              <w:left w:w="80" w:type="dxa"/>
-              <w:right w:w="80" w:type="dxa"/>
+              <w:top w:w="110" w:type="dxa"/>
+              <w:bottom w:w="110" w:type="dxa"/>
+              <w:left w:w="60" w:type="dxa"/>
+              <w:right w:w="60" w:type="dxa"/>
             </w:tcMar>
-            <w:shd w:fill="FAF8F2"/>
           </w:tcPr>
-          <w:p/>
-        </w:tc>
-        <w:tc>
-          <w:tcPr>
-            <w:tcW w:type="dxa" w:w="1587"/>
-            <w:shd w:fill="F8FAFC"/>
-            <w:tcMar>
-              <w:top w:w="140" w:type="dxa"/>
-              <w:bottom w:w="140" w:type="dxa"/>
-              <w:left w:w="80" w:type="dxa"/>
-              <w:right w:w="80" w:type="dxa"/>
-            </w:tcMar>
-            <w:shd w:fill="FAF8F2"/>
-          </w:tcPr>
-          <w:p/>
+          <w:p>
+            <w:pPr>
+              <w:spacing w:after="0"/>
+            </w:pPr>
+          </w:p>
         </w:tc>
       </w:tr>
       <w:tr>
         <w:tc>
           <w:tcPr>
             <w:tcW w:type="dxa" w:w="1701"/>
-            <w:shd w:fill="FFFBEB"/>
+            <w:shd w:fill="FFFDF5"/>
             <w:tcMar>
-              <w:top w:w="140" w:type="dxa"/>
-              <w:bottom w:w="140" w:type="dxa"/>
-              <w:left w:w="80" w:type="dxa"/>
-              <w:right w:w="80" w:type="dxa"/>
+              <w:top w:w="110" w:type="dxa"/>
+              <w:bottom w:w="110" w:type="dxa"/>
+              <w:left w:w="60" w:type="dxa"/>
+              <w:right w:w="60" w:type="dxa"/>
             </w:tcMar>
-            <w:shd w:fill="FFFDF5"/>
           </w:tcPr>
           <w:p>
+            <w:pPr>
+              <w:spacing w:after="0"/>
+            </w:pPr>
             <w:r>
               <w:rPr>
                 <w:rFonts w:ascii="PingFang TC" w:hAnsi="PingFang TC"/>
                 <w:b/>
-                <w:color w:val="A83212"/>
-                <w:sz w:val="18"/>
+                <w:color w:val="B8860B"/>
+                <w:sz w:val="17"/>
               </w:rPr>
               <w:t>龍社路 597 號</w:t>
             </w:r>
@@ -897,92 +937,109 @@
             <w:tcW w:type="dxa" w:w="1474"/>
             <w:shd w:fill="FFFFFF"/>
             <w:tcMar>
-              <w:top w:w="140" w:type="dxa"/>
-              <w:bottom w:w="140" w:type="dxa"/>
-              <w:left w:w="80" w:type="dxa"/>
-              <w:right w:w="80" w:type="dxa"/>
+              <w:top w:w="110" w:type="dxa"/>
+              <w:bottom w:w="110" w:type="dxa"/>
+              <w:left w:w="60" w:type="dxa"/>
+              <w:right w:w="60" w:type="dxa"/>
             </w:tcMar>
-            <w:shd w:fill="FFFDF5"/>
           </w:tcPr>
-          <w:p/>
+          <w:p>
+            <w:pPr>
+              <w:spacing w:after="0"/>
+            </w:pPr>
+          </w:p>
         </w:tc>
         <w:tc>
           <w:tcPr>
             <w:tcW w:type="dxa" w:w="1587"/>
             <w:shd w:fill="FFFFFF"/>
             <w:tcMar>
-              <w:top w:w="140" w:type="dxa"/>
-              <w:bottom w:w="140" w:type="dxa"/>
-              <w:left w:w="80" w:type="dxa"/>
-              <w:right w:w="80" w:type="dxa"/>
+              <w:top w:w="110" w:type="dxa"/>
+              <w:bottom w:w="110" w:type="dxa"/>
+              <w:left w:w="60" w:type="dxa"/>
+              <w:right w:w="60" w:type="dxa"/>
             </w:tcMar>
-            <w:shd w:fill="FFFDF5"/>
           </w:tcPr>
-          <w:p/>
+          <w:p>
+            <w:pPr>
+              <w:spacing w:after="0"/>
+            </w:pPr>
+          </w:p>
         </w:tc>
         <w:tc>
           <w:tcPr>
             <w:tcW w:type="dxa" w:w="1587"/>
             <w:shd w:fill="FFFFFF"/>
             <w:tcMar>
-              <w:top w:w="140" w:type="dxa"/>
-              <w:bottom w:w="140" w:type="dxa"/>
-              <w:left w:w="80" w:type="dxa"/>
-              <w:right w:w="80" w:type="dxa"/>
+              <w:top w:w="110" w:type="dxa"/>
+              <w:bottom w:w="110" w:type="dxa"/>
+              <w:left w:w="60" w:type="dxa"/>
+              <w:right w:w="60" w:type="dxa"/>
             </w:tcMar>
-            <w:shd w:fill="FFFDF5"/>
           </w:tcPr>
-          <w:p/>
+          <w:p>
+            <w:pPr>
+              <w:spacing w:after="0"/>
+            </w:pPr>
+          </w:p>
+        </w:tc>
+        <w:tc>
+          <w:tcPr>
+            <w:tcW w:type="dxa" w:w="1814"/>
+            <w:shd w:fill="FFFFFF"/>
+            <w:tcMar>
+              <w:top w:w="110" w:type="dxa"/>
+              <w:bottom w:w="110" w:type="dxa"/>
+              <w:left w:w="60" w:type="dxa"/>
+              <w:right w:w="60" w:type="dxa"/>
+            </w:tcMar>
+          </w:tcPr>
+          <w:p>
+            <w:pPr>
+              <w:spacing w:after="0"/>
+            </w:pPr>
+          </w:p>
         </w:tc>
         <w:tc>
           <w:tcPr>
             <w:tcW w:type="dxa" w:w="1701"/>
             <w:shd w:fill="FFFFFF"/>
             <w:tcMar>
-              <w:top w:w="140" w:type="dxa"/>
-              <w:bottom w:w="140" w:type="dxa"/>
-              <w:left w:w="80" w:type="dxa"/>
-              <w:right w:w="80" w:type="dxa"/>
+              <w:top w:w="110" w:type="dxa"/>
+              <w:bottom w:w="110" w:type="dxa"/>
+              <w:left w:w="60" w:type="dxa"/>
+              <w:right w:w="60" w:type="dxa"/>
             </w:tcMar>
-            <w:shd w:fill="FFFDF5"/>
           </w:tcPr>
-          <w:p/>
-        </w:tc>
-        <w:tc>
-          <w:tcPr>
-            <w:tcW w:type="dxa" w:w="1587"/>
-            <w:shd w:fill="FFFFFF"/>
-            <w:tcMar>
-              <w:top w:w="140" w:type="dxa"/>
-              <w:bottom w:w="140" w:type="dxa"/>
-              <w:left w:w="80" w:type="dxa"/>
-              <w:right w:w="80" w:type="dxa"/>
-            </w:tcMar>
-            <w:shd w:fill="FFFDF5"/>
-          </w:tcPr>
-          <w:p/>
+          <w:p>
+            <w:pPr>
+              <w:spacing w:after="0"/>
+            </w:pPr>
+          </w:p>
         </w:tc>
       </w:tr>
       <w:tr>
         <w:tc>
           <w:tcPr>
             <w:tcW w:type="dxa" w:w="1701"/>
-            <w:shd w:fill="FFFBEB"/>
+            <w:shd w:fill="FFFDF5"/>
             <w:tcMar>
-              <w:top w:w="140" w:type="dxa"/>
-              <w:bottom w:w="140" w:type="dxa"/>
-              <w:left w:w="80" w:type="dxa"/>
-              <w:right w:w="80" w:type="dxa"/>
+              <w:top w:w="110" w:type="dxa"/>
+              <w:bottom w:w="110" w:type="dxa"/>
+              <w:left w:w="60" w:type="dxa"/>
+              <w:right w:w="60" w:type="dxa"/>
             </w:tcMar>
-            <w:shd w:fill="FAF8F2"/>
           </w:tcPr>
           <w:p>
+            <w:pPr>
+              <w:spacing w:after="0"/>
+            </w:pPr>
             <w:r>
               <w:rPr>
                 <w:rFonts w:ascii="PingFang TC" w:hAnsi="PingFang TC"/>
                 <w:b/>
-                <w:color w:val="A83212"/>
-                <w:sz w:val="18"/>
+                <w:color w:val="B8860B"/>
+                <w:sz w:val="17"/>
               </w:rPr>
               <w:t>龍社路 599 號</w:t>
             </w:r>
@@ -991,94 +1048,111 @@
         <w:tc>
           <w:tcPr>
             <w:tcW w:type="dxa" w:w="1474"/>
-            <w:shd w:fill="F8FAFC"/>
+            <w:shd w:fill="FAF8F2"/>
             <w:tcMar>
-              <w:top w:w="140" w:type="dxa"/>
-              <w:bottom w:w="140" w:type="dxa"/>
-              <w:left w:w="80" w:type="dxa"/>
-              <w:right w:w="80" w:type="dxa"/>
+              <w:top w:w="110" w:type="dxa"/>
+              <w:bottom w:w="110" w:type="dxa"/>
+              <w:left w:w="60" w:type="dxa"/>
+              <w:right w:w="60" w:type="dxa"/>
             </w:tcMar>
-            <w:shd w:fill="FAF8F2"/>
           </w:tcPr>
-          <w:p/>
+          <w:p>
+            <w:pPr>
+              <w:spacing w:after="0"/>
+            </w:pPr>
+          </w:p>
         </w:tc>
         <w:tc>
           <w:tcPr>
             <w:tcW w:type="dxa" w:w="1587"/>
-            <w:shd w:fill="F8FAFC"/>
+            <w:shd w:fill="FAF8F2"/>
             <w:tcMar>
-              <w:top w:w="140" w:type="dxa"/>
-              <w:bottom w:w="140" w:type="dxa"/>
-              <w:left w:w="80" w:type="dxa"/>
-              <w:right w:w="80" w:type="dxa"/>
+              <w:top w:w="110" w:type="dxa"/>
+              <w:bottom w:w="110" w:type="dxa"/>
+              <w:left w:w="60" w:type="dxa"/>
+              <w:right w:w="60" w:type="dxa"/>
             </w:tcMar>
-            <w:shd w:fill="FAF8F2"/>
           </w:tcPr>
-          <w:p/>
+          <w:p>
+            <w:pPr>
+              <w:spacing w:after="0"/>
+            </w:pPr>
+          </w:p>
         </w:tc>
         <w:tc>
           <w:tcPr>
             <w:tcW w:type="dxa" w:w="1587"/>
-            <w:shd w:fill="F8FAFC"/>
+            <w:shd w:fill="FAF8F2"/>
             <w:tcMar>
-              <w:top w:w="140" w:type="dxa"/>
-              <w:bottom w:w="140" w:type="dxa"/>
-              <w:left w:w="80" w:type="dxa"/>
-              <w:right w:w="80" w:type="dxa"/>
+              <w:top w:w="110" w:type="dxa"/>
+              <w:bottom w:w="110" w:type="dxa"/>
+              <w:left w:w="60" w:type="dxa"/>
+              <w:right w:w="60" w:type="dxa"/>
             </w:tcMar>
+          </w:tcPr>
+          <w:p>
+            <w:pPr>
+              <w:spacing w:after="0"/>
+            </w:pPr>
+          </w:p>
+        </w:tc>
+        <w:tc>
+          <w:tcPr>
+            <w:tcW w:type="dxa" w:w="1814"/>
             <w:shd w:fill="FAF8F2"/>
+            <w:tcMar>
+              <w:top w:w="110" w:type="dxa"/>
+              <w:bottom w:w="110" w:type="dxa"/>
+              <w:left w:w="60" w:type="dxa"/>
+              <w:right w:w="60" w:type="dxa"/>
+            </w:tcMar>
           </w:tcPr>
-          <w:p/>
+          <w:p>
+            <w:pPr>
+              <w:spacing w:after="0"/>
+            </w:pPr>
+          </w:p>
         </w:tc>
         <w:tc>
           <w:tcPr>
             <w:tcW w:type="dxa" w:w="1701"/>
-            <w:shd w:fill="F8FAFC"/>
+            <w:shd w:fill="FAF8F2"/>
             <w:tcMar>
-              <w:top w:w="140" w:type="dxa"/>
-              <w:bottom w:w="140" w:type="dxa"/>
-              <w:left w:w="80" w:type="dxa"/>
-              <w:right w:w="80" w:type="dxa"/>
+              <w:top w:w="110" w:type="dxa"/>
+              <w:bottom w:w="110" w:type="dxa"/>
+              <w:left w:w="60" w:type="dxa"/>
+              <w:right w:w="60" w:type="dxa"/>
             </w:tcMar>
-            <w:shd w:fill="FAF8F2"/>
           </w:tcPr>
-          <w:p/>
-        </w:tc>
-        <w:tc>
-          <w:tcPr>
-            <w:tcW w:type="dxa" w:w="1587"/>
-            <w:shd w:fill="F8FAFC"/>
-            <w:tcMar>
-              <w:top w:w="140" w:type="dxa"/>
-              <w:bottom w:w="140" w:type="dxa"/>
-              <w:left w:w="80" w:type="dxa"/>
-              <w:right w:w="80" w:type="dxa"/>
-            </w:tcMar>
-            <w:shd w:fill="FAF8F2"/>
-          </w:tcPr>
-          <w:p/>
+          <w:p>
+            <w:pPr>
+              <w:spacing w:after="0"/>
+            </w:pPr>
+          </w:p>
         </w:tc>
       </w:tr>
       <w:tr>
         <w:tc>
           <w:tcPr>
             <w:tcW w:type="dxa" w:w="1701"/>
-            <w:shd w:fill="FFFBEB"/>
+            <w:shd w:fill="FFFDF5"/>
             <w:tcMar>
-              <w:top w:w="140" w:type="dxa"/>
-              <w:bottom w:w="140" w:type="dxa"/>
-              <w:left w:w="80" w:type="dxa"/>
-              <w:right w:w="80" w:type="dxa"/>
+              <w:top w:w="110" w:type="dxa"/>
+              <w:bottom w:w="110" w:type="dxa"/>
+              <w:left w:w="60" w:type="dxa"/>
+              <w:right w:w="60" w:type="dxa"/>
             </w:tcMar>
-            <w:shd w:fill="FFFDF5"/>
           </w:tcPr>
           <w:p>
+            <w:pPr>
+              <w:spacing w:after="0"/>
+            </w:pPr>
             <w:r>
               <w:rPr>
                 <w:rFonts w:ascii="PingFang TC" w:hAnsi="PingFang TC"/>
                 <w:b/>
-                <w:color w:val="A83212"/>
-                <w:sz w:val="18"/>
+                <w:color w:val="B8860B"/>
+                <w:sz w:val="17"/>
               </w:rPr>
               <w:t>龍社路 601 號</w:t>
             </w:r>
@@ -1089,92 +1163,109 @@
             <w:tcW w:type="dxa" w:w="1474"/>
             <w:shd w:fill="FFFFFF"/>
             <w:tcMar>
-              <w:top w:w="140" w:type="dxa"/>
-              <w:bottom w:w="140" w:type="dxa"/>
-              <w:left w:w="80" w:type="dxa"/>
-              <w:right w:w="80" w:type="dxa"/>
+              <w:top w:w="110" w:type="dxa"/>
+              <w:bottom w:w="110" w:type="dxa"/>
+              <w:left w:w="60" w:type="dxa"/>
+              <w:right w:w="60" w:type="dxa"/>
             </w:tcMar>
-            <w:shd w:fill="FFFDF5"/>
           </w:tcPr>
-          <w:p/>
+          <w:p>
+            <w:pPr>
+              <w:spacing w:after="0"/>
+            </w:pPr>
+          </w:p>
         </w:tc>
         <w:tc>
           <w:tcPr>
             <w:tcW w:type="dxa" w:w="1587"/>
             <w:shd w:fill="FFFFFF"/>
             <w:tcMar>
-              <w:top w:w="140" w:type="dxa"/>
-              <w:bottom w:w="140" w:type="dxa"/>
-              <w:left w:w="80" w:type="dxa"/>
-              <w:right w:w="80" w:type="dxa"/>
+              <w:top w:w="110" w:type="dxa"/>
+              <w:bottom w:w="110" w:type="dxa"/>
+              <w:left w:w="60" w:type="dxa"/>
+              <w:right w:w="60" w:type="dxa"/>
             </w:tcMar>
-            <w:shd w:fill="FFFDF5"/>
           </w:tcPr>
-          <w:p/>
+          <w:p>
+            <w:pPr>
+              <w:spacing w:after="0"/>
+            </w:pPr>
+          </w:p>
         </w:tc>
         <w:tc>
           <w:tcPr>
             <w:tcW w:type="dxa" w:w="1587"/>
             <w:shd w:fill="FFFFFF"/>
             <w:tcMar>
-              <w:top w:w="140" w:type="dxa"/>
-              <w:bottom w:w="140" w:type="dxa"/>
-              <w:left w:w="80" w:type="dxa"/>
-              <w:right w:w="80" w:type="dxa"/>
+              <w:top w:w="110" w:type="dxa"/>
+              <w:bottom w:w="110" w:type="dxa"/>
+              <w:left w:w="60" w:type="dxa"/>
+              <w:right w:w="60" w:type="dxa"/>
             </w:tcMar>
-            <w:shd w:fill="FFFDF5"/>
           </w:tcPr>
-          <w:p/>
+          <w:p>
+            <w:pPr>
+              <w:spacing w:after="0"/>
+            </w:pPr>
+          </w:p>
+        </w:tc>
+        <w:tc>
+          <w:tcPr>
+            <w:tcW w:type="dxa" w:w="1814"/>
+            <w:shd w:fill="FFFFFF"/>
+            <w:tcMar>
+              <w:top w:w="110" w:type="dxa"/>
+              <w:bottom w:w="110" w:type="dxa"/>
+              <w:left w:w="60" w:type="dxa"/>
+              <w:right w:w="60" w:type="dxa"/>
+            </w:tcMar>
+          </w:tcPr>
+          <w:p>
+            <w:pPr>
+              <w:spacing w:after="0"/>
+            </w:pPr>
+          </w:p>
         </w:tc>
         <w:tc>
           <w:tcPr>
             <w:tcW w:type="dxa" w:w="1701"/>
             <w:shd w:fill="FFFFFF"/>
             <w:tcMar>
-              <w:top w:w="140" w:type="dxa"/>
-              <w:bottom w:w="140" w:type="dxa"/>
-              <w:left w:w="80" w:type="dxa"/>
-              <w:right w:w="80" w:type="dxa"/>
+              <w:top w:w="110" w:type="dxa"/>
+              <w:bottom w:w="110" w:type="dxa"/>
+              <w:left w:w="60" w:type="dxa"/>
+              <w:right w:w="60" w:type="dxa"/>
             </w:tcMar>
-            <w:shd w:fill="FFFDF5"/>
           </w:tcPr>
-          <w:p/>
-        </w:tc>
-        <w:tc>
-          <w:tcPr>
-            <w:tcW w:type="dxa" w:w="1587"/>
-            <w:shd w:fill="FFFFFF"/>
-            <w:tcMar>
-              <w:top w:w="140" w:type="dxa"/>
-              <w:bottom w:w="140" w:type="dxa"/>
-              <w:left w:w="80" w:type="dxa"/>
-              <w:right w:w="80" w:type="dxa"/>
-            </w:tcMar>
-            <w:shd w:fill="FFFDF5"/>
-          </w:tcPr>
-          <w:p/>
+          <w:p>
+            <w:pPr>
+              <w:spacing w:after="0"/>
+            </w:pPr>
+          </w:p>
         </w:tc>
       </w:tr>
       <w:tr>
         <w:tc>
           <w:tcPr>
             <w:tcW w:type="dxa" w:w="1701"/>
-            <w:shd w:fill="FFFBEB"/>
+            <w:shd w:fill="FFFDF5"/>
             <w:tcMar>
-              <w:top w:w="140" w:type="dxa"/>
-              <w:bottom w:w="140" w:type="dxa"/>
-              <w:left w:w="80" w:type="dxa"/>
-              <w:right w:w="80" w:type="dxa"/>
+              <w:top w:w="110" w:type="dxa"/>
+              <w:bottom w:w="110" w:type="dxa"/>
+              <w:left w:w="60" w:type="dxa"/>
+              <w:right w:w="60" w:type="dxa"/>
             </w:tcMar>
-            <w:shd w:fill="FAF8F2"/>
           </w:tcPr>
           <w:p>
+            <w:pPr>
+              <w:spacing w:after="0"/>
+            </w:pPr>
             <w:r>
               <w:rPr>
                 <w:rFonts w:ascii="PingFang TC" w:hAnsi="PingFang TC"/>
                 <w:b/>
-                <w:color w:val="A83212"/>
-                <w:sz w:val="18"/>
+                <w:color w:val="B8860B"/>
+                <w:sz w:val="17"/>
               </w:rPr>
               <w:t>龍社路 603 號</w:t>
             </w:r>
@@ -1183,78 +1274,93 @@
         <w:tc>
           <w:tcPr>
             <w:tcW w:type="dxa" w:w="1474"/>
-            <w:shd w:fill="F8FAFC"/>
+            <w:shd w:fill="FAF8F2"/>
             <w:tcMar>
-              <w:top w:w="140" w:type="dxa"/>
-              <w:bottom w:w="140" w:type="dxa"/>
-              <w:left w:w="80" w:type="dxa"/>
-              <w:right w:w="80" w:type="dxa"/>
+              <w:top w:w="110" w:type="dxa"/>
+              <w:bottom w:w="110" w:type="dxa"/>
+              <w:left w:w="60" w:type="dxa"/>
+              <w:right w:w="60" w:type="dxa"/>
             </w:tcMar>
-            <w:shd w:fill="FAF8F2"/>
           </w:tcPr>
-          <w:p/>
+          <w:p>
+            <w:pPr>
+              <w:spacing w:after="0"/>
+            </w:pPr>
+          </w:p>
         </w:tc>
         <w:tc>
           <w:tcPr>
             <w:tcW w:type="dxa" w:w="1587"/>
-            <w:shd w:fill="F8FAFC"/>
+            <w:shd w:fill="FAF8F2"/>
             <w:tcMar>
-              <w:top w:w="140" w:type="dxa"/>
-              <w:bottom w:w="140" w:type="dxa"/>
-              <w:left w:w="80" w:type="dxa"/>
-              <w:right w:w="80" w:type="dxa"/>
+              <w:top w:w="110" w:type="dxa"/>
+              <w:bottom w:w="110" w:type="dxa"/>
+              <w:left w:w="60" w:type="dxa"/>
+              <w:right w:w="60" w:type="dxa"/>
             </w:tcMar>
-            <w:shd w:fill="FAF8F2"/>
           </w:tcPr>
-          <w:p/>
+          <w:p>
+            <w:pPr>
+              <w:spacing w:after="0"/>
+            </w:pPr>
+          </w:p>
         </w:tc>
         <w:tc>
           <w:tcPr>
             <w:tcW w:type="dxa" w:w="1587"/>
-            <w:shd w:fill="F8FAFC"/>
+            <w:shd w:fill="FAF8F2"/>
             <w:tcMar>
-              <w:top w:w="140" w:type="dxa"/>
-              <w:bottom w:w="140" w:type="dxa"/>
-              <w:left w:w="80" w:type="dxa"/>
-              <w:right w:w="80" w:type="dxa"/>
+              <w:top w:w="110" w:type="dxa"/>
+              <w:bottom w:w="110" w:type="dxa"/>
+              <w:left w:w="60" w:type="dxa"/>
+              <w:right w:w="60" w:type="dxa"/>
             </w:tcMar>
+          </w:tcPr>
+          <w:p>
+            <w:pPr>
+              <w:spacing w:after="0"/>
+            </w:pPr>
+          </w:p>
+        </w:tc>
+        <w:tc>
+          <w:tcPr>
+            <w:tcW w:type="dxa" w:w="1814"/>
             <w:shd w:fill="FAF8F2"/>
+            <w:tcMar>
+              <w:top w:w="110" w:type="dxa"/>
+              <w:bottom w:w="110" w:type="dxa"/>
+              <w:left w:w="60" w:type="dxa"/>
+              <w:right w:w="60" w:type="dxa"/>
+            </w:tcMar>
           </w:tcPr>
-          <w:p/>
+          <w:p>
+            <w:pPr>
+              <w:spacing w:after="0"/>
+            </w:pPr>
+          </w:p>
         </w:tc>
         <w:tc>
           <w:tcPr>
             <w:tcW w:type="dxa" w:w="1701"/>
-            <w:shd w:fill="F8FAFC"/>
+            <w:shd w:fill="FAF8F2"/>
             <w:tcMar>
-              <w:top w:w="140" w:type="dxa"/>
-              <w:bottom w:w="140" w:type="dxa"/>
-              <w:left w:w="80" w:type="dxa"/>
-              <w:right w:w="80" w:type="dxa"/>
+              <w:top w:w="110" w:type="dxa"/>
+              <w:bottom w:w="110" w:type="dxa"/>
+              <w:left w:w="60" w:type="dxa"/>
+              <w:right w:w="60" w:type="dxa"/>
             </w:tcMar>
-            <w:shd w:fill="FAF8F2"/>
           </w:tcPr>
-          <w:p/>
-        </w:tc>
-        <w:tc>
-          <w:tcPr>
-            <w:tcW w:type="dxa" w:w="1587"/>
-            <w:shd w:fill="F8FAFC"/>
-            <w:tcMar>
-              <w:top w:w="140" w:type="dxa"/>
-              <w:bottom w:w="140" w:type="dxa"/>
-              <w:left w:w="80" w:type="dxa"/>
-              <w:right w:w="80" w:type="dxa"/>
-            </w:tcMar>
-            <w:shd w:fill="FAF8F2"/>
-          </w:tcPr>
-          <w:p/>
+          <w:p>
+            <w:pPr>
+              <w:spacing w:after="0"/>
+            </w:pPr>
+          </w:p>
         </w:tc>
       </w:tr>
     </w:tbl>
     <w:p>
       <w:pPr>
-        <w:spacing w:before="240" w:after="80"/>
+        <w:spacing w:before="80" w:after="80"/>
       </w:pPr>
     </w:p>
     <w:tbl>
@@ -1264,37 +1370,36 @@
         <w:tblLook w:firstColumn="1" w:firstRow="1" w:lastColumn="0" w:lastRow="0" w:noHBand="0" w:noVBand="1" w:val="04A0"/>
       </w:tblPr>
       <w:tblGrid>
-        <w:gridCol w:w="9638"/>
+        <w:gridCol w:w="9866"/>
       </w:tblGrid>
       <w:tr>
         <w:tc>
           <w:tcPr>
-            <w:tcW w:type="dxa" w:w="9638"/>
-            <w:shd w:fill="FFFBEB"/>
+            <w:tcW w:type="dxa" w:w="9865"/>
+            <w:shd w:fill="FFFDF5"/>
             <w:tcMar>
-              <w:top w:w="120" w:type="dxa"/>
-              <w:bottom w:w="120" w:type="dxa"/>
-              <w:left w:w="180" w:type="dxa"/>
-              <w:right w:w="160" w:type="dxa"/>
+              <w:top w:w="70" w:type="dxa"/>
+              <w:bottom w:w="70" w:type="dxa"/>
+              <w:left w:w="120" w:type="dxa"/>
+              <w:right w:w="100" w:type="dxa"/>
             </w:tcMar>
             <w:tcBorders>
-              <w:left w:val="single" w:sz="28" w:space="0" w:color="DE5814"/>
+              <w:left w:val="single" w:sz="24" w:space="0" w:color="D4AF37"/>
               <w:top w:val="none"/>
               <w:right w:val="none"/>
               <w:bottom w:val="none"/>
             </w:tcBorders>
-            <w:shd w:fill="1A1D20"/>
           </w:tcPr>
           <w:p>
             <w:pPr>
-              <w:spacing w:line="300" w:lineRule="auto"/>
+              <w:spacing w:line="288" w:lineRule="auto" w:after="0"/>
             </w:pPr>
             <w:r>
               <w:rPr>
                 <w:rFonts w:ascii="PingFang TC" w:hAnsi="PingFang TC"/>
                 <w:b/>
-                <w:color w:val="D4AF37"/>
-                <w:sz w:val="20"/>
+                <w:color w:val="B8860B"/>
+                <w:sz w:val="18"/>
               </w:rPr>
               <w:t>【全體區權人共同委任授權條款】</w:t>
               <w:br/>
@@ -1302,9 +1407,8 @@
             <w:r>
               <w:rPr>
                 <w:rFonts w:ascii="PingFang TC" w:hAnsi="PingFang TC"/>
-                <w:b/>
-                <w:color w:val="D4AF37"/>
-                <w:sz w:val="18"/>
+                <w:color w:val="1A1D20"/>
+                <w:sz w:val="17"/>
               </w:rPr>
               <w:t>本連署人等謹此共同推派並全權委託 廖倫豪 先生 代表本區 6 戶區權人，全權向富宇大地社區管理委員會提出本提案申請書、出席協商會議、確認資產清算明細，並向台中市龍井區公所辦理獨立管委會備查相關事宜。</w:t>
               <w:br/>
@@ -1314,69 +1418,68 @@
         </w:tc>
       </w:tr>
     </w:tbl>
-    <w:p/>
     <w:p>
       <w:pPr>
-        <w:spacing w:before="200" w:after="40"/>
+        <w:spacing w:before="120" w:after="40"/>
       </w:pPr>
       <w:r>
         <w:rPr>
           <w:rFonts w:ascii="PingFang TC" w:hAnsi="PingFang TC"/>
           <w:b/>
-          <w:color w:val="D4AF37"/>
-          <w:sz w:val="20"/>
+          <w:color w:val="B8860B"/>
+          <w:sz w:val="18"/>
         </w:rPr>
         <w:t>【檢附附件】</w:t>
       </w:r>
     </w:p>
     <w:p>
       <w:pPr>
-        <w:spacing w:line="288" w:lineRule="auto" w:before="20" w:after="40"/>
+        <w:spacing w:line="276" w:lineRule="auto" w:before="0" w:after="20"/>
       </w:pPr>
       <w:r>
         <w:rPr>
           <w:rFonts w:ascii="PingFang TC" w:hAnsi="PingFang TC"/>
-          <w:color w:val="2D3748"/>
-          <w:sz w:val="17"/>
+          <w:color w:val="8C8273"/>
+          <w:sz w:val="16"/>
         </w:rPr>
         <w:t>附件一：《法定獨立分割可行性研究報告書》（全本乙份）</w:t>
       </w:r>
     </w:p>
     <w:p>
       <w:pPr>
-        <w:spacing w:line="288" w:lineRule="auto" w:before="20" w:after="40"/>
+        <w:spacing w:line="276" w:lineRule="auto" w:before="0" w:after="20"/>
       </w:pPr>
       <w:r>
         <w:rPr>
           <w:rFonts w:ascii="PingFang TC" w:hAnsi="PingFang TC"/>
-          <w:color w:val="2D3748"/>
-          <w:sz w:val="17"/>
+          <w:color w:val="8C8273"/>
+          <w:sz w:val="16"/>
         </w:rPr>
         <w:t>附件二：富宇大地全區地籍圖及建築物使用執照影本（標註 A2 大境臨龍社路獨立出入）</w:t>
       </w:r>
     </w:p>
     <w:p>
       <w:pPr>
-        <w:spacing w:line="288" w:lineRule="auto" w:before="20" w:after="40"/>
+        <w:spacing w:line="276" w:lineRule="auto" w:before="0" w:after="20"/>
       </w:pPr>
       <w:r>
         <w:rPr>
           <w:rFonts w:ascii="PingFang TC" w:hAnsi="PingFang TC"/>
-          <w:color w:val="2D3748"/>
-          <w:sz w:val="17"/>
+          <w:color w:val="8C8273"/>
+          <w:sz w:val="16"/>
         </w:rPr>
         <w:t>附件三：富宇大地 115 年 5 月與 9 月例行會議記錄及新光銀行定存財報（載明 A2 定存單 $220,231 元）</w:t>
       </w:r>
     </w:p>
     <w:p>
       <w:pPr>
-        <w:spacing w:line="288" w:lineRule="auto" w:before="20" w:after="40"/>
+        <w:spacing w:line="276" w:lineRule="auto" w:before="0" w:after="20"/>
       </w:pPr>
       <w:r>
         <w:rPr>
           <w:rFonts w:ascii="PingFang TC" w:hAnsi="PingFang TC"/>
-          <w:color w:val="B8860B"/>
-          <w:sz w:val="17"/>
+          <w:color w:val="8C8273"/>
+          <w:sz w:val="16"/>
         </w:rPr>
         <w:t>附件四：《富宇大境共用設施無依賴切結與生活垃圾自行清運承諾書》</w:t>
       </w:r>
@@ -1385,7 +1488,7 @@
       <w:headerReference w:type="default" r:id="rId9"/>
       <w:footerReference w:type="default" r:id="rId10"/>
       <w:pgSz w:w="11906" w:h="16838"/>
-      <w:pgMar w:top="1134" w:right="1134" w:bottom="1134" w:left="1134" w:header="720" w:footer="720" w:gutter="0"/>
+      <w:pgMar w:top="907" w:right="1020" w:bottom="907" w:left="1020" w:header="720" w:footer="720" w:gutter="0"/>
       <w:cols w:space="720"/>
       <w:docGrid w:linePitch="360"/>
     </w:sectPr>
@@ -1458,10 +1561,10 @@
     <w:r>
       <w:rPr>
         <w:rFonts w:ascii="PingFang TC" w:hAnsi="PingFang TC"/>
-        <w:color w:val="718096"/>
-        <w:sz w:val="17"/>
-      </w:rPr>
-      <w:t>富宇大境（A2 區）獨立分割正式提案申請書暨全體連署同意書 ｜ 法定公文</w:t>
+        <w:color w:val="8C8273"/>
+        <w:sz w:val="16"/>
+      </w:rPr>
+      <w:t>富宇大境（A2 區）法定獨立分割正式公文 ｜ 專案編號：FY-SPLIT-2026-A2</w:t>
     </w:r>
   </w:p>
 </w:hdr>

</xml_diff>